<commit_message>
Dissertatsiyani real manbalar (PDF) asosida qayta yozish: iqtiboslar + manba matnlari
</commit_message>
<xml_diff>
--- a/dissertatsiya/Dissertatsiya.docx
+++ b/dissertatsiya/Dissertatsiya.docx
@@ -304,7 +304,7 @@
         <w:t xml:space="preserve">2</w:t>
       </w:r>
       <w:r>
-        <w:t xml:space="preserve">O) oksidlanadi.</w:t>
+        <w:t xml:space="preserve">O) oksidlanadi [1, 2].</w:t>
       </w:r>
     </w:p>
     <w:p>
@@ -326,16 +326,16 @@
         <w:t xml:space="preserve">Tayanch so'zlar:</w:t>
       </w:r>
       <w:r>
-        <w:t xml:space="preserve"> fotosintez, fotokataliz, titan dioksidi (TiO</w:t>
-      </w:r>
-      <w:r>
-        <w:rPr>
-          <w:vertAlign w:val="subscript"/>
-        </w:rPr>
-        <w:t xml:space="preserve">2</w:t>
-      </w:r>
-      <w:r>
-        <w:t xml:space="preserve">), rux oksidi (ZnO), adsorbent, silikagel, aktiv ko'mir, nano-g'ovakli oksid, havoni tozalash, o'zini tozalovchi qoplama, zol-gel usuli, anataz.</w:t>
+        <w:t xml:space="preserve"> tabiiy fotosintez, fotokataliz, titan dioksidi (TiO</w:t>
+      </w:r>
+      <w:r>
+        <w:rPr>
+          <w:vertAlign w:val="subscript"/>
+        </w:rPr>
+        <w:t xml:space="preserve">2</w:t>
+      </w:r>
+      <w:r>
+        <w:t xml:space="preserve">), rux oksidi (ZnO), adsorbent, silikagel, aktiv ko'mir, nano-g'ovakli oksid, havoni tozalash, o'zini tozalovchi qoplama, zol-gel usuli, bioinspiratsion materiallar, anataz.</w:t>
       </w:r>
     </w:p>
     <w:p>
@@ -362,7 +362,7 @@
         <w:t xml:space="preserve">Mavzuning dolzarbligi.</w:t>
       </w:r>
       <w:r>
-        <w:t xml:space="preserve"> Zamonaviy dunyoda atmosfera havosining ifloslanishi insoniyat oldida turgan eng jiddiy ekologik muammolardan biriga aylandi. Jahon sog'liqni saqlash tashkiloti (JSST) ma'lumotlariga ko'ra, havo ifloslanishi har yili millionlab odamning bevaqt o'limiga sabab bo'lmoqda. Sanoat korxonalari, avtotransport, issiqlik elektr stansiyalari va maishiy manbalardan atmosferaga azot oksidlari (NO</w:t>
+        <w:t xml:space="preserve"> So'nggi yillarda atmosfera havosining antropogen ifloslanishi inson salomatligi va atrof-muhit barqarorligiga jiddiy xavf tug'dirmoqda [1]. Jahon sog'liqni saqlash tashkiloti ma'lumotlariga ko'ra, havo ifloslanishi har yili millionlab odamning bevaqt o'limiga sabab bo'lmoqda. Sanoat korxonalari, avtotransport va maishiy manbalardan atmosferaga azot oksidlari (NO</w:t>
       </w:r>
       <w:r>
         <w:rPr>
@@ -380,7 +380,7 @@
         <w:t xml:space="preserve">2</w:t>
       </w:r>
       <w:r>
-        <w:t xml:space="preserve">), uglerod oksidi (CO), uchuvchan organik birikmalar (VOC), formaldegid hamda mayda zarrachalar (PM2.5, PM10) chiqarilmoqda. Yopiq xonalarda esa qurilish materiallari, bo'yoq va mebellardan ajraladigan formaldegid va boshqa zaharli moddalar inson salomatligiga bevosita ta'sir ko'rsatadi.</w:t>
+        <w:t xml:space="preserve">), uchuvchan organik birikmalar (VOC), formaldegid hamda mayda zarrachalar (PM2.5, PM10) chiqarilmoqda. Ayniqsa yopiq xonalarda uchuvchan organik birikmalar (VOC) havo ifloslanishining keng tarqalgan tarkibiy qismi hisoblanadi [3]. Shu sababli havoni tozalashning innovatsion va ekologik jihatdan xavfsiz usullarini ishlab chiqish dolzarb ilmiy masalalardan biridir.</w:t>
       </w:r>
     </w:p>
     <w:p>
@@ -406,16 +406,16 @@
         <w:t xml:space="preserve">2</w:t>
       </w:r>
       <w:r>
-        <w:t xml:space="preserve">) ajratadi. Aynan shu tabiiy jarayon g'oyasi olimlarni "sun'iy fotosintez" yoki fotokataliz asosida ishlovchi materiallarni yaratishga ilhomlantirdi. Fotokatalitik qoplamalar yorug'lik ta'sirida havodagi ifloslantiruvchilarni zararsiz moddalarga (CO</w:t>
-      </w:r>
-      <w:r>
-        <w:rPr>
-          <w:vertAlign w:val="subscript"/>
-        </w:rPr>
-        <w:t xml:space="preserve">2</w:t>
-      </w:r>
-      <w:r>
-        <w:t xml:space="preserve"> va suvga) parchalaydi, ya'ni tabiiy fotosintezga o'xshash vazifani bajaradi.</w:t>
+        <w:t xml:space="preserve">) ajratadi. Aynan shu tabiiy jarayon g'oyasi olimlarni "sun'iy fotosintez" (artificial photosynthesis) va fotokataliz asosida ishlovchi materiallarni yaratishga ilhomlantirdi [2]. Fotokatalitik qoplamalar yorug'lik ta'sirida havodagi ifloslantiruvchilarni zararsiz moddalarga (CO</w:t>
+      </w:r>
+      <w:r>
+        <w:rPr>
+          <w:vertAlign w:val="subscript"/>
+        </w:rPr>
+        <w:t xml:space="preserve">2</w:t>
+      </w:r>
+      <w:r>
+        <w:t xml:space="preserve"> va suvga) parchalaydi, ya'ni tabiiy fotosintezga o'xshash vazifani bajaradi [1].</w:t>
       </w:r>
     </w:p>
     <w:p>
@@ -500,7 +500,7 @@
         <w:t xml:space="preserve">•-</w:t>
       </w:r>
       <w:r>
-        <w:t xml:space="preserve">) vujudga keladi. Bu radikallar organik ifloslantiruvchilarni to'liq mineralizatsiya qiladi. Bunday qoplamalarni silikagel va aktiv ko'mir kabi yuqori solishtirma yuzaga ega adsorbentlar bilan birlashtirish ifloslantiruvchini avval yutib (adsorbsiya), so'ngra parchalash (fotokataliz) imkonini beradi va umumiy samaradorlikni sezilarli oshiradi. Shu sababli mazkur yo'nalishdagi tadqiqotlar bugungi kunda nihoyatda dolzarbdir.</w:t>
+        <w:t xml:space="preserve">) vujudga keladi [1, 5]. Bunday qoplamalarni silikagel va aktiv ko'mir kabi yuqori solishtirma yuzaga ega adsorbentlar bilan birlashtirish ifloslantiruvchini avval yutib (adsorbsiya), so'ngra parchalash (fotokataliz) imkonini beradi va umumiy samaradorlikni sezilarli oshiradi [3, 4].</w:t>
       </w:r>
     </w:p>
     <w:p>
@@ -621,13 +621,8 @@
         <w:t xml:space="preserve">2</w:t>
       </w:r>
       <w:r>
-        <w:t xml:space="preserve"> va ZnO asosidagi adsorbent va fotokatalitik qoplamalar hamda ularni olish jarayonlari.</w:t>
-      </w:r>
-    </w:p>
-    <w:p>
-      <w:pPr>
-        <w:pStyle w:val="Body"/>
-      </w:pPr>
+        <w:t xml:space="preserve"> va ZnO asosidagi adsorbent va fotokatalitik qoplamalar hamda ularni olish jarayonlari. </w:t>
+      </w:r>
       <w:r>
         <w:rPr>
           <w:b/>
@@ -649,7 +644,7 @@
         <w:t xml:space="preserve">Tadqiqotning ilmiy yangiligi.</w:t>
       </w:r>
       <w:r>
-        <w:t xml:space="preserve"> Tabiiy fotosintez g'oyasi asosida adsorbent (silikagel, aktiv ko'mir) va fotofaol oksid (TiO</w:t>
+        <w:t xml:space="preserve"> Tabiiy fotosintez g'oyasi asosida adsorbent va fotofaol oksid (TiO</w:t>
       </w:r>
       <w:r>
         <w:rPr>
@@ -672,21 +667,7 @@
         <w:t xml:space="preserve">Amaliy ahamiyati.</w:t>
       </w:r>
       <w:r>
-        <w:t xml:space="preserve"> Ishlab chiqilgan yondashuvlar binolarning ichki devorlari, shamollatish tizimlari, ko'cha inshootlari va o'zini tozalovchi yuzalar uchun ekologik toza qoplamalar yaratishda foydalanilishi mumkin.</w:t>
-      </w:r>
-    </w:p>
-    <w:p>
-      <w:pPr>
-        <w:pStyle w:val="Body"/>
-      </w:pPr>
-      <w:r>
-        <w:rPr>
-          <w:b/>
-        </w:rPr>
-        <w:t xml:space="preserve">Dissertatsiyaning tuzilishi.</w:t>
-      </w:r>
-      <w:r>
-        <w:t xml:space="preserve"> Ish kirish, uchta bob, har bob bo'yicha xulosalar, umumiy xulosa va foydalanilgan adabiyotlar ro'yxatidan iborat.</w:t>
+        <w:t xml:space="preserve"> Ishlab chiqilgan yondashuvlar binolarning ichki devorlari va fasadlari, shamollatish tizimlari, ko'cha inshootlari va o'zini tozalovchi yuzalar uchun ekologik toza qoplamalar yaratishda foydalanilishi mumkin [6, 7].</w:t>
       </w:r>
     </w:p>
     <w:p>
@@ -716,7 +697,7 @@
         <w:t xml:space="preserve">2</w:t>
       </w:r>
       <w:r>
-        <w:t xml:space="preserve">, ZnO). Ushbu bobda mazkur materiallarning manbalari, olinishi va fizik-kimyoviy xossalari batafsil ko'rib chiqiladi.</w:t>
+        <w:t xml:space="preserve">, ZnO) [1]. Ushbu bobda mazkur materiallarning manbalari, olinishi va fizik-kimyoviy xossalari batafsil ko'rib chiqiladi.</w:t>
       </w:r>
     </w:p>
     <w:p>
@@ -732,7 +713,7 @@
         <w:pStyle w:val="Body"/>
       </w:pPr>
       <w:r>
-        <w:t xml:space="preserve">Adsorbsiya - bu gaz yoki suyuqlikdagi moddalar (adsorbat) molekulalarining qattiq jism (adsorbent) yuzasida to'planishi hodisasidir. Adsorbentlar deb yuqori rivojlangan g'ovakli tuzilishga va katta solishtirma yuzaga ega bo'lgan, o'z yuzasida boshqa moddalarni ushlab qolish qobiliyatiga ega qattiq materiallarga aytiladi. Adsorbsiya mexanizmiga ko'ra ikki turga ajratiladi: </w:t>
+        <w:t xml:space="preserve">Adsorbsiya - bu gaz yoki suyuqlikdagi moddalar (adsorbat) molekulalarining qattiq jism (adsorbent) yuzasida to'planishi hodisasidir. Adsorbentlar deb yuqori rivojlangan g'ovakli tuzilishga va katta solishtirma yuzaga ega bo'lgan qattiq materiallarga aytiladi. Adsorbsiya mexanizmiga ko'ra ikki turga ajratiladi: </w:t>
       </w:r>
       <w:r>
         <w:rPr>
@@ -776,7 +757,7 @@
         <w:t xml:space="preserve">2</w:t>
       </w:r>
       <w:r>
-        <w:t xml:space="preserve">/g) bo'lib, u BET (Brunauer-Emmett-Teller) usuli yordamida aniqlanadi. Shuningdek, g'ovak hajmi va g'ovak diametri ham muhim ahamiyatga ega. Xalqaro IUPAC tasnifiga ko'ra g'ovaklar uch guruhga bo'linadi: mikrog'ovaklar (diametri 2 nm dan kichik), mezag'ovaklar (2-50 nm) va makrog'ovaklar (50 nm dan katta).</w:t>
+        <w:t xml:space="preserve">/g) bo'lib, u BET (Brunauer-Emmett-Teller) usuli yordamida aniqlanadi. Xalqaro IUPAC tasnifiga ko'ra g'ovaklar uch guruhga bo'linadi: mikrog'ovaklar (2 nm dan kichik), mezag'ovaklar (2-50 nm) va makrog'ovaklar (50 nm dan katta). Havoni tozalashda biologik adsorbentlar - tirik mikroorganizmlar asosidagi tizimlar (biofiltrlar) ham istiqbolli yo'nalish sifatida o'rganilmoqda [8].</w:t>
       </w:r>
     </w:p>
     <w:p>
@@ -837,7 +818,7 @@
         <w:pStyle w:val="Body"/>
       </w:pPr>
       <w:r>
-        <w:t xml:space="preserve">Yuqoridagi sxemada ko'rsatilganidek, adsorbentlar tarkibiga ko'ra uglerod asosli (aktiv ko'mir, grafen, uglerod nanotubalari), oksid asosli (silikagel, alyuminiy oksidi, zeolitlar), fotofaol oksidlar (TiO</w:t>
+        <w:t xml:space="preserve">Adsorbentlar tarkibiga ko'ra uglerod asosli (aktiv ko'mir, grafen, uglerod nanotubalari), oksid asosli (silikagel, alyuminiy oksidi, zeolitlar), fotofaol oksidlar (TiO</w:t>
       </w:r>
       <w:r>
         <w:rPr>
@@ -855,7 +836,7 @@
         <w:t xml:space="preserve">3</w:t>
       </w:r>
       <w:r>
-        <w:t xml:space="preserve">) hamda tabiiy/biologik (gil, tuproq, mikrosuvo'tlar) guruhlarga ajratiladi. Havoni tozalovchi qoplamalarda ko'pincha adsorbsiya xossasiga ega g'ovakli materiallar fotofaol oksidlar bilan birgalikda qo'llaniladi: bunda adsorbent ifloslantiruvchini o'ziga tortadi, fotokatalizator esa uni parchalaydi.</w:t>
+        <w:t xml:space="preserve">) hamda tabiiy/biologik (gil, tuproq, mikrosuvo'tlar) guruhlarga ajratiladi. Havoni tozalovchi qoplamalarda adsorbsiya xossasiga ega g'ovakli materiallar fotofaol oksidlar bilan birgalikda qo'llaniladi: adsorbent ifloslantiruvchini o'ziga tortadi, fotokatalizator esa uni parchalaydi [3, 4].</w:t>
       </w:r>
     </w:p>
     <w:p>
@@ -942,7 +923,7 @@
         <w:t xml:space="preserve">3</w:t>
       </w:r>
       <w:r>
-        <w:t xml:space="preserve">) ni mineral kislota (sulfat yoki xlorid kislota) bilan ishlov berish orqali olinadi. Jarayon quyidagi bosqichlardan iborat:</w:t>
+        <w:t xml:space="preserve">) ni mineral kislota bilan ishlov berish orqali olinadi. Jarayon quyidagi bosqichlardan iborat:</w:t>
       </w:r>
     </w:p>
     <w:p>
@@ -1003,7 +984,7 @@
         <w:pStyle w:val="Body"/>
       </w:pPr>
       <w:r>
-        <w:t xml:space="preserve">Reaksiya natijasida kremniy kislotasi hosil bo'ladi, u polimerlanib gel'ga aylanadi: Na</w:t>
+        <w:t xml:space="preserve">Reaksiya natijasida kremniy kislotasi hosil bo'lib, u polimerlanib gel'ga aylanadi: Na</w:t>
       </w:r>
       <w:r>
         <w:rPr>
@@ -1075,7 +1056,16 @@
         <w:t xml:space="preserve">4</w:t>
       </w:r>
       <w:r>
-        <w:t xml:space="preserve">. Hosil bo'lgan gel yuviladi (natriy ionlaridan tozalanadi), so'ngra 100-200 °C haroratda quritiladi. Quritish sharoiti silikagelning g'ovak tuzilishini belgilaydi. Silikagel kimyoviy barqaror, yonmaydigan va qayta tiklanadigan (regeneratsiya qilinadigan) material bo'lganligi uchun qoplama tarkibida tashuvchi (matritsa) sifatida ham xizmat qiladi.</w:t>
+        <w:t xml:space="preserve">. Hosil bo'lgan gel yuviladi, so'ngra 100-200 °C haroratda quritiladi. Silikagel kimyoviy barqaror, yonmaydigan va qayta tiklanadigan material bo'lib, fotokatalitik qoplamalarda fotokatalizator uchun </w:t>
+      </w:r>
+      <w:r>
+        <w:rPr>
+          <w:b/>
+        </w:rPr>
+        <w:t xml:space="preserve">tashuvchi matritsa</w:t>
+      </w:r>
+      <w:r>
+        <w:t xml:space="preserve"> (nositel) sifatida ham keng xizmat qiladi [5].</w:t>
       </w:r>
     </w:p>
     <w:p>
@@ -1091,7 +1081,7 @@
         <w:pStyle w:val="Body"/>
       </w:pPr>
       <w:r>
-        <w:t xml:space="preserve">Aktiv ko'mir (faollashtirilgan ko'mir) - eng keng tarqalgan uglerod asosli adsorbent bo'lib, juda yuqori solishtirma yuzaga (900-1500 m</w:t>
+        <w:t xml:space="preserve">Aktiv ko'mir - eng keng tarqalgan uglerod asosli adsorbent bo'lib, juda yuqori solishtirma yuzaga (900-1500 m</w:t>
       </w:r>
       <w:r>
         <w:rPr>
@@ -1100,7 +1090,7 @@
         <w:t xml:space="preserve">2</w:t>
       </w:r>
       <w:r>
-        <w:t xml:space="preserve">/g, ba'zan undan ham yuqori) ega. U asosan mikrog'ovakli tuzilishga ega bo'lib, gazlar, organik bug'lar, hidlar va ranglarni samarali yutadi. Aktiv ko'mirning </w:t>
+        <w:t xml:space="preserve">/g) ega. U asosan mikrog'ovakli tuzilishga ega bo'lib, gazlar, organik bug'lar, hidlar va ranglarni samarali yutadi. Aktiv ko'mirning </w:t>
       </w:r>
       <w:r>
         <w:rPr>
@@ -1109,7 +1099,7 @@
         <w:t xml:space="preserve">xomashyosi</w:t>
       </w:r>
       <w:r>
-        <w:t xml:space="preserve"> sifatida o'simlik va mineral kelib chiqishiga ega ko'plab materiallar ishlatiladi: yong'oq po'sti, yog'och, ko'mir (torf, qo'ng'ir va tosh ko'mir), shaftoli va o'rik danaklari, paxta chiqindilari hamda kokos qobig'i.</w:t>
+        <w:t xml:space="preserve"> sifatida yong'oq po'sti, yog'och, ko'mir (torf, qo'ng'ir va tosh ko'mir), shaftoli va o'rik danaklari, paxta chiqindilari hamda kokos qobig'i ishlatiladi.</w:t>
       </w:r>
     </w:p>
     <w:p>
@@ -1179,7 +1169,7 @@
         <w:t xml:space="preserve">karbonizatsiya</w:t>
       </w:r>
       <w:r>
-        <w:t xml:space="preserve">: xomashyo kislorodsiz muhitda 400-600 °C haroratda kuydiriladi, natijada uchuvchan moddalar chiqib ketadi va uglerodga boy qoldiq hosil bo'ladi. Ikkinchisi - </w:t>
+        <w:t xml:space="preserve">: xomashyo kislorodsiz muhitda 400-600 °C haroratda kuydiriladi. Ikkinchisi - </w:t>
       </w:r>
       <w:r>
         <w:rPr>
@@ -1188,7 +1178,7 @@
         <w:t xml:space="preserve">aktivatsiya</w:t>
       </w:r>
       <w:r>
-        <w:t xml:space="preserve"> (faollashtirish): karbonizat 800-1000 °C da suv bug'i yoki CO</w:t>
+        <w:t xml:space="preserve">: karbonizat 800-1000 °C da suv bug'i yoki CO</w:t>
       </w:r>
       <w:r>
         <w:rPr>
@@ -1224,7 +1214,16 @@
         <w:t xml:space="preserve">2</w:t>
       </w:r>
       <w:r>
-        <w:t xml:space="preserve"> kabi reagentlar bilan (kimyoviy aktivatsiya) ishlov beriladi. Aktivatsiya jarayonida ko'plab mayda g'ovaklar ochilib, materialning solishtirma yuzasi keskin oshadi. O'zbekistonda paxta chiqindilari va mevali daraxtlar danaklari arzon va qayta tiklanadigan xomashyo manbai bo'la oladi.</w:t>
+        <w:t xml:space="preserve"> kabi reagentlar bilan (kimyoviy aktivatsiya) ishlov beriladi. Aktivatsiya jarayonida ko'plab mayda g'ovaklar ochilib, materialning solishtirma yuzasi keskin oshadi. O'zbekistonda paxta chiqindilari va mevali daraxtlar danaklari arzon va qayta tiklanadigan xomashyo manbai bo'la oladi. Aktiv ko'mir VOC larni yutishda samarali bo'lgani uchun fotokatalitik tizimlarda ko'pincha TiO</w:t>
+      </w:r>
+      <w:r>
+        <w:rPr>
+          <w:vertAlign w:val="subscript"/>
+        </w:rPr>
+        <w:t xml:space="preserve">2</w:t>
+      </w:r>
+      <w:r>
+        <w:t xml:space="preserve"> bilan birga qo'llaniladi [3].</w:t>
       </w:r>
     </w:p>
     <w:p>
@@ -1258,7 +1257,7 @@
         <w:t xml:space="preserve">taqiqlangan zona</w:t>
       </w:r>
       <w:r>
-        <w:t xml:space="preserve"> (band gap, Eg) kengligi bilan belgilanadi - bu valent zonasi (VB) va o'tkazuvchanlik zonasi (CB) orasidagi energetik tafovutdir.</w:t>
+        <w:t xml:space="preserve"> (band gap, Eg) kengligi bilan belgilanadi - bu valent zonasi (VB) va o'tkazuvchanlik zonasi (CB) orasidagi energetik tafovutdir [2].</w:t>
       </w:r>
     </w:p>
     <w:p>
@@ -1374,7 +1373,7 @@
         <w:t xml:space="preserve">2</w:t>
       </w:r>
       <w:r>
-        <w:t xml:space="preserve"> kimyoviy inert, zaharsiz, arzon va korroziyaga chidamli bo'lganligi uchun keng qo'llaniladi. Uning zichligi ≈ 4,2 g/sm</w:t>
+        <w:t xml:space="preserve"> kimyoviy inert, zaharsiz, arzon va korroziyaga chidamli bo'lganligi uchun keng qo'llaniladi (zichligi ≈ 4,2 g/sm</w:t>
       </w:r>
       <w:r>
         <w:rPr>
@@ -1383,7 +1382,19 @@
         <w:t xml:space="preserve">3</w:t>
       </w:r>
       <w:r>
-        <w:t xml:space="preserve">, erish harorati 1843 °C.</w:t>
+        <w:t xml:space="preserve">, erish harorati 1843 °C). TiO</w:t>
+      </w:r>
+      <w:r>
+        <w:rPr>
+          <w:vertAlign w:val="subscript"/>
+        </w:rPr>
+        <w:t xml:space="preserve">2</w:t>
+      </w:r>
+      <w:r>
+        <w:t xml:space="preserve"> ning katta kamchiligi - u faqat UV nurida (quyosh nurining </w:t>
+      </w:r>
+      <w:r>
+        <w:t xml:space="preserve">5% i) faol bo'lishi; shu sababli uni ko'rinadigan yorug'likda ham faol qilish bo'yicha tadqiqotlar olib borilmoqda [5].</w:t>
       </w:r>
     </w:p>
     <w:p>
@@ -1406,7 +1417,7 @@
         <w:t xml:space="preserve">2</w:t>
       </w:r>
       <w:r>
-        <w:t xml:space="preserve"> ga yaqin (Eg ≈ 3,37 eV). ZnO yuqori elektron harakatchanligi va katta eksiton bog'lanish energiyasi (≈ 60 meV) bilan ajralib turadi. U ko'rinadigan yorug'likka yaqin sohada ham faollik ko'rsatishi mumkin, biroq UV nurida fotokorroziyaga moyilligi uning kamchiligi hisoblanadi. Ikkala oksid ham nanostrukturali holatda (nanozarra, nanosterjen, nanonaycha) sezilarli darajada yuqori fotofaollik namoyon etadi, chunki nano-o'lcham solishtirma yuzani oshiradi.</w:t>
+        <w:t xml:space="preserve"> ga yaqin (Eg ≈ 3,37 eV). ZnO yuqori elektron harakatchanligi va katta eksiton bog'lanish energiyasi (≈ 60 meV) bilan ajralib turadi. Ikkala oksid ham nanostrukturali holatda (nanozarra, nanosterjen, nanonaycha) sezilarli darajada yuqori fotofaollik namoyon etadi, chunki nano-o'lcham solishtirma yuzani oshiradi [1, 5].</w:t>
       </w:r>
     </w:p>
     <w:p>
@@ -1485,7 +1496,7 @@
         <w:t xml:space="preserve">2</w:t>
       </w:r>
       <w:r>
-        <w:t xml:space="preserve"> yoki ZnO nanozarralarini yuqori yuzali adsorbent (silikagel, aktiv ko'mir) yuzasiga o'tirg'izish (immobilizatsiya) maqsadga muvofiqdir: bunda har ikkala xususiyat - adsorbsiya va fotokataliz - uyg'unlashadi.</w:t>
+        <w:t xml:space="preserve"> yoki ZnO nanozarralarini yuqori yuzali adsorbent yuzasiga o'tirg'izish (immobilizatsiya) maqsadga muvofiqdir: bunda adsorbsiya va fotokataliz uyg'unlashadi [3, 4].</w:t>
       </w:r>
     </w:p>
     <w:p>
@@ -1568,7 +1579,7 @@
         <w:t xml:space="preserve">Silikagel</w:t>
       </w:r>
       <w:r>
-        <w:t xml:space="preserve"> namlik yutuvchi (osmotik quritgich) sifatida oziq-ovqat, farmatsevtika va elektronika qadoqlarida, gazlarni quritishda, xromatografiyada qo'llaniladi. </w:t>
+        <w:t xml:space="preserve"> namlik yutuvchi sifatida oziq-ovqat, farmatsevtika va elektronika qadoqlarida, gazlarni quritishda qo'llaniladi. </w:t>
       </w:r>
       <w:r>
         <w:rPr>
@@ -1577,7 +1588,7 @@
         <w:t xml:space="preserve">Aktiv ko'mir</w:t>
       </w:r>
       <w:r>
-        <w:t xml:space="preserve"> suvni va havoni tozalashda, gaz niqoblarida, tibbiyotda (zaharlanishda), shakar va spirt ishlab chiqarishda rangsizlantiruvchi sifatida ishlatiladi. </w:t>
+        <w:t xml:space="preserve"> suvni va havoni tozalashda, gaz niqoblarida, tibbiyotda ishlatiladi. </w:t>
       </w:r>
       <w:r>
         <w:rPr>
@@ -1593,7 +1604,7 @@
         <w:t xml:space="preserve">2</w:t>
       </w:r>
       <w:r>
-        <w:t xml:space="preserve"> oq pigment (bo'yoq, qog'oz, plastmassa), quyoshdan himoya kremlari, o'zini tozalovchi oynalar va devor qoplamalarida, </w:t>
+        <w:t xml:space="preserve"> oq pigment, quyoshdan himoya kremlari, o'zini tozalovchi oynalar va devor qoplamalarida, </w:t>
       </w:r>
       <w:r>
         <w:rPr>
@@ -1602,7 +1613,7 @@
         <w:t xml:space="preserve">ZnO</w:t>
       </w:r>
       <w:r>
-        <w:t xml:space="preserve"> esa rezina sanoati, kosmetika, antibakterial qoplamalar va quyosh elementlarida keng foydalaniladi. Maishiy sohada fotokatalitik qoplamalar bilan qoplangan kafel, oyna va bo'yoqlar binoning ichki havosini tozalash va yuzalarni o'zini tozalovchi qilishda qo'llanilmoqda.</w:t>
+        <w:t xml:space="preserve"> esa rezina sanoati, kosmetika va antibakterial qoplamalarda foydalaniladi. Maishiy va shaharsozlik sohasida fotokatalitik qoplamalar bilan qoplangan kafel, oyna, bo'yoq va hatto bino fasadlari binolarning ichki havosini tozalashda qo'llanilmoqda [6, 7].</w:t>
       </w:r>
     </w:p>
     <w:p>
@@ -1625,7 +1636,7 @@
         <w:t xml:space="preserve">2</w:t>
       </w:r>
       <w:r>
-        <w:t xml:space="preserve"> (anataz) va ZnO esa quyosh/UV nuri ta'sirida fotokatalitik faollik ko'rsatadigan asosiy yarimo'tkazgichlardir. Bu materiallarni birlashtirish havoni tozalovchi samarali qoplamalar yaratish uchun istiqbolli yondashuvdir.</w:t>
+        <w:t xml:space="preserve"> (anataz) va ZnO esa quyosh/UV nuri ta'sirida fotokatalitik faollik ko'rsatadigan asosiy yarimo'tkazgichlardir. Bu materiallarni birlashtirish havoni tozalovchi samarali qoplamalar yaratish uchun istiqbolli yondashuvdir [1, 5].</w:t>
       </w:r>
     </w:p>
     <w:p>
@@ -1662,132 +1673,155 @@
         <w:pStyle w:val="Body"/>
       </w:pPr>
       <w:r>
-        <w:t xml:space="preserve">Tabiiy fotosintez - yashil o'simliklar, suvo'tlar va ayrim bakteriyalarning quyosh nuri energiyasidan foydalanib, suv (H</w:t>
-      </w:r>
-      <w:r>
-        <w:rPr>
-          <w:vertAlign w:val="subscript"/>
-        </w:rPr>
-        <w:t xml:space="preserve">2</w:t>
-      </w:r>
-      <w:r>
-        <w:t xml:space="preserve">O) va karbonat angidrid (CO</w:t>
-      </w:r>
-      <w:r>
-        <w:rPr>
-          <w:vertAlign w:val="subscript"/>
-        </w:rPr>
-        <w:t xml:space="preserve">2</w:t>
-      </w:r>
-      <w:r>
-        <w:t xml:space="preserve">) dan organik moddalar (glyukoza) va kislorod (O</w:t>
-      </w:r>
-      <w:r>
-        <w:rPr>
-          <w:vertAlign w:val="subscript"/>
-        </w:rPr>
-        <w:t xml:space="preserve">2</w:t>
-      </w:r>
-      <w:r>
-        <w:t xml:space="preserve">) hosil qilish jarayonidir. Umumiy reaksiya: 6CO</w:t>
-      </w:r>
-      <w:r>
-        <w:rPr>
-          <w:vertAlign w:val="subscript"/>
-        </w:rPr>
-        <w:t xml:space="preserve">2</w:t>
-      </w:r>
-      <w:r>
+        <w:t xml:space="preserve">Tabiiy fotosintez - yashil o'simliklar, suvo'tlar va ayrim bakteriyalarning quyosh nuri energiyasidan foydalanib, suv va karbonat angidriddan organik moddalar va kislorod hosil qilish jarayonidir. Umumiy reaksiya quyidagicha ifodalanadi [1]:</w:t>
+      </w:r>
+    </w:p>
+    <w:p>
+      <w:pPr>
+        <w:jc w:val="center"/>
+        <w:spacing w:before="0" w:after="80"/>
+        <w:ind w:firstLine="0"/>
+      </w:pPr>
+      <w:r>
+        <w:rPr>
+          <w:b/>
+        </w:rPr>
+        <w:t xml:space="preserve">6CO</w:t>
+      </w:r>
+      <w:r>
+        <w:rPr>
+          <w:b/>
+          <w:vertAlign w:val="subscript"/>
+        </w:rPr>
+        <w:t xml:space="preserve">2</w:t>
+      </w:r>
+      <w:r>
+        <w:rPr>
+          <w:b/>
+        </w:rPr>
         <w:t xml:space="preserve"> + 6H</w:t>
       </w:r>
       <w:r>
         <w:rPr>
-          <w:vertAlign w:val="subscript"/>
-        </w:rPr>
-        <w:t xml:space="preserve">2</w:t>
-      </w:r>
-      <w:r>
-        <w:t xml:space="preserve">O + (yorug'lik) → C</w:t>
-      </w:r>
-      <w:r>
-        <w:rPr>
+          <w:b/>
+          <w:vertAlign w:val="subscript"/>
+        </w:rPr>
+        <w:t xml:space="preserve">2</w:t>
+      </w:r>
+      <w:r>
+        <w:rPr>
+          <w:b/>
+        </w:rPr>
+        <w:t xml:space="preserve">O + hν → C</w:t>
+      </w:r>
+      <w:r>
+        <w:rPr>
+          <w:b/>
           <w:vertAlign w:val="subscript"/>
         </w:rPr>
         <w:t xml:space="preserve">6</w:t>
       </w:r>
       <w:r>
+        <w:rPr>
+          <w:b/>
+        </w:rPr>
         <w:t xml:space="preserve">H</w:t>
       </w:r>
       <w:r>
         <w:rPr>
+          <w:b/>
           <w:vertAlign w:val="subscript"/>
         </w:rPr>
         <w:t xml:space="preserve">12</w:t>
       </w:r>
       <w:r>
+        <w:rPr>
+          <w:b/>
+        </w:rPr>
         <w:t xml:space="preserve">O</w:t>
       </w:r>
       <w:r>
         <w:rPr>
+          <w:b/>
           <w:vertAlign w:val="subscript"/>
         </w:rPr>
         <w:t xml:space="preserve">6</w:t>
       </w:r>
       <w:r>
+        <w:rPr>
+          <w:b/>
+        </w:rPr>
         <w:t xml:space="preserve"> + 6O</w:t>
       </w:r>
       <w:r>
         <w:rPr>
-          <w:vertAlign w:val="subscript"/>
-        </w:rPr>
-        <w:t xml:space="preserve">2</w:t>
-      </w:r>
-      <w:r>
-        <w:t xml:space="preserve">. Bu jarayonda xlorofill pigmenti yorug'lik kvantlarini yutadi va energiyani kimyoviy bog'lar energiyasiga aylantiradi. Natijada havodan CO</w:t>
-      </w:r>
-      <w:r>
-        <w:rPr>
-          <w:vertAlign w:val="subscript"/>
-        </w:rPr>
-        <w:t xml:space="preserve">2</w:t>
-      </w:r>
-      <w:r>
-        <w:t xml:space="preserve"> olib tashlanadi va kislorod bilan boyitiladi - bu tabiatning havoni tozalash mexanizmidir.</w:t>
-      </w:r>
-    </w:p>
-    <w:p>
-      <w:pPr>
-        <w:pStyle w:val="Body"/>
-      </w:pPr>
-      <w:r>
-        <w:t xml:space="preserve">Sun'iy fotokataliz aynan shu g'oyaga asoslanadi. Fotokatalizatorda (TiO</w:t>
-      </w:r>
-      <w:r>
-        <w:rPr>
-          <w:vertAlign w:val="subscript"/>
-        </w:rPr>
-        <w:t xml:space="preserve">2</w:t>
-      </w:r>
-      <w:r>
-        <w:t xml:space="preserve">, ZnO) xlorofill rolini yarimo'tkazgich bajaradi: yorug'lik kvanti (foton) energiyasi taqiqlangan zona kengligidan katta bo'lsa (hν ≥ Eg), elektron valent zonasidan o'tkazuvchanlik zonasiga o'tadi va elektron-kovak (e</w:t>
-      </w:r>
-      <w:r>
-        <w:rPr>
+          <w:b/>
+          <w:vertAlign w:val="subscript"/>
+        </w:rPr>
+        <w:t xml:space="preserve">2</w:t>
+      </w:r>
+    </w:p>
+    <w:p>
+      <w:pPr>
+        <w:pStyle w:val="Body"/>
+      </w:pPr>
+      <w:r>
+        <w:t xml:space="preserve">Bu jarayonda xlorofill pigmenti yorug'lik kvantlarini yutadi va energiyani kimyoviy bog'lar energiyasiga aylantiradi. Sun'iy fotokataliz aynan shu g'oyaga asoslanadi: fotokatalizatorda (TiO</w:t>
+      </w:r>
+      <w:r>
+        <w:rPr>
+          <w:vertAlign w:val="subscript"/>
+        </w:rPr>
+        <w:t xml:space="preserve">2</w:t>
+      </w:r>
+      <w:r>
+        <w:t xml:space="preserve">, ZnO) xlorofill rolini yarimo'tkazgich bajaradi [2]. Yorug'lik kvanti energiyasi taqiqlangan zona kengligidan katta bo'lsa (hν ≥ Eg), elektron-kovak juftligi hosil bo'ladi:</w:t>
+      </w:r>
+    </w:p>
+    <w:p>
+      <w:pPr>
+        <w:jc w:val="center"/>
+        <w:spacing w:before="0" w:after="80"/>
+        <w:ind w:firstLine="0"/>
+      </w:pPr>
+      <w:r>
+        <w:rPr>
+          <w:b/>
+        </w:rPr>
+        <w:t xml:space="preserve">TiO</w:t>
+      </w:r>
+      <w:r>
+        <w:rPr>
+          <w:b/>
+          <w:vertAlign w:val="subscript"/>
+        </w:rPr>
+        <w:t xml:space="preserve">2</w:t>
+      </w:r>
+      <w:r>
+        <w:rPr>
+          <w:b/>
+        </w:rPr>
+        <w:t xml:space="preserve"> + hν → e</w:t>
+      </w:r>
+      <w:r>
+        <w:rPr>
+          <w:b/>
           <w:vertAlign w:val="superscript"/>
         </w:rPr>
         <w:t xml:space="preserve">-</w:t>
       </w:r>
       <w:r>
-        <w:t xml:space="preserve">/h</w:t>
-      </w:r>
-      <w:r>
-        <w:rPr>
+        <w:rPr>
+          <w:b/>
+        </w:rPr>
+        <w:t xml:space="preserve"> + h</w:t>
+      </w:r>
+      <w:r>
+        <w:rPr>
+          <w:b/>
           <w:vertAlign w:val="superscript"/>
         </w:rPr>
         <w:t xml:space="preserve">+</w:t>
-      </w:r>
-      <w:r>
-        <w:t xml:space="preserve">) juftligi hosil bo'ladi. Quyidagi rasmda ikki jarayonning qiyosi keltirilgan.</w:t>
       </w:r>
     </w:p>
     <w:p>
@@ -1857,127 +1891,99 @@
         <w:pStyle w:val="Body"/>
       </w:pPr>
       <w:r>
-        <w:t xml:space="preserve">Fotokataliz mexanizmi quyidagicha kechadi. O'tkazuvchanlik zonasidagi elektron (e</w:t>
-      </w:r>
-      <w:r>
-        <w:rPr>
+        <w:t xml:space="preserve">O'tkazuvchanlik zonasidagi elektron kislorod bilan superoksid radikalini, valent zonasidagi kovak esa suv bilan gidroksil radikalini hosil qiladi [1]:</w:t>
+      </w:r>
+    </w:p>
+    <w:p>
+      <w:pPr>
+        <w:jc w:val="center"/>
+        <w:spacing w:before="0" w:after="80"/>
+        <w:ind w:firstLine="0"/>
+      </w:pPr>
+      <w:r>
+        <w:rPr>
+          <w:b/>
+        </w:rPr>
+        <w:t xml:space="preserve">e</w:t>
+      </w:r>
+      <w:r>
+        <w:rPr>
+          <w:b/>
           <w:vertAlign w:val="superscript"/>
         </w:rPr>
         <w:t xml:space="preserve">-</w:t>
       </w:r>
       <w:r>
-        <w:t xml:space="preserve">) havodagi kislorod bilan reaksiyaga kirib superoksid radikalini hosil qiladi: e</w:t>
-      </w:r>
-      <w:r>
-        <w:rPr>
+        <w:rPr>
+          <w:b/>
+        </w:rPr>
+        <w:t xml:space="preserve"> + O</w:t>
+      </w:r>
+      <w:r>
+        <w:rPr>
+          <w:b/>
+          <w:vertAlign w:val="subscript"/>
+        </w:rPr>
+        <w:t xml:space="preserve">2</w:t>
+      </w:r>
+      <w:r>
+        <w:rPr>
+          <w:b/>
+        </w:rPr>
+        <w:t xml:space="preserve"> → •O</w:t>
+      </w:r>
+      <w:r>
+        <w:rPr>
+          <w:b/>
+          <w:vertAlign w:val="subscript"/>
+        </w:rPr>
+        <w:t xml:space="preserve">2</w:t>
+      </w:r>
+      <w:r>
+        <w:rPr>
+          <w:b/>
           <w:vertAlign w:val="superscript"/>
         </w:rPr>
         <w:t xml:space="preserve">-</w:t>
       </w:r>
       <w:r>
-        <w:t xml:space="preserve"> + O</w:t>
-      </w:r>
-      <w:r>
-        <w:rPr>
-          <w:vertAlign w:val="subscript"/>
-        </w:rPr>
-        <w:t xml:space="preserve">2</w:t>
-      </w:r>
-      <w:r>
-        <w:t xml:space="preserve"> → O</w:t>
-      </w:r>
-      <w:r>
-        <w:rPr>
-          <w:vertAlign w:val="subscript"/>
-        </w:rPr>
-        <w:t xml:space="preserve">2</w:t>
-      </w:r>
-      <w:r>
-        <w:rPr>
+        <w:rPr>
+          <w:b/>
+        </w:rPr>
+        <w:t xml:space="preserve">   ;   h</w:t>
+      </w:r>
+      <w:r>
+        <w:rPr>
+          <w:b/>
           <w:vertAlign w:val="superscript"/>
         </w:rPr>
-        <w:t xml:space="preserve">•-</w:t>
-      </w:r>
-      <w:r>
-        <w:t xml:space="preserve">. Valent zonasidagi kovak (h</w:t>
-      </w:r>
-      <w:r>
-        <w:rPr>
+        <w:t xml:space="preserve">+</w:t>
+      </w:r>
+      <w:r>
+        <w:rPr>
+          <w:b/>
+        </w:rPr>
+        <w:t xml:space="preserve"> + H</w:t>
+      </w:r>
+      <w:r>
+        <w:rPr>
+          <w:b/>
+          <w:vertAlign w:val="subscript"/>
+        </w:rPr>
+        <w:t xml:space="preserve">2</w:t>
+      </w:r>
+      <w:r>
+        <w:rPr>
+          <w:b/>
+        </w:rPr>
+        <w:t xml:space="preserve">O → •OH + H</w:t>
+      </w:r>
+      <w:r>
+        <w:rPr>
+          <w:b/>
           <w:vertAlign w:val="superscript"/>
         </w:rPr>
         <w:t xml:space="preserve">+</w:t>
-      </w:r>
-      <w:r>
-        <w:t xml:space="preserve">) esa suv yoki gidroksil guruh bilan reaksiyaga kirib gidroksil radikalini beradi: h</w:t>
-      </w:r>
-      <w:r>
-        <w:rPr>
-          <w:vertAlign w:val="superscript"/>
-        </w:rPr>
-        <w:t xml:space="preserve">+</w:t>
-      </w:r>
-      <w:r>
-        <w:t xml:space="preserve"> + H</w:t>
-      </w:r>
-      <w:r>
-        <w:rPr>
-          <w:vertAlign w:val="subscript"/>
-        </w:rPr>
-        <w:t xml:space="preserve">2</w:t>
-      </w:r>
-      <w:r>
-        <w:t xml:space="preserve">O → •OH + H</w:t>
-      </w:r>
-      <w:r>
-        <w:rPr>
-          <w:vertAlign w:val="superscript"/>
-        </w:rPr>
-        <w:t xml:space="preserve">+</w:t>
-      </w:r>
-      <w:r>
-        <w:t xml:space="preserve">. Bu radikallar (•OH, O</w:t>
-      </w:r>
-      <w:r>
-        <w:rPr>
-          <w:vertAlign w:val="subscript"/>
-        </w:rPr>
-        <w:t xml:space="preserve">2</w:t>
-      </w:r>
-      <w:r>
-        <w:rPr>
-          <w:vertAlign w:val="superscript"/>
-        </w:rPr>
-        <w:t xml:space="preserve">•-</w:t>
-      </w:r>
-      <w:r>
-        <w:t xml:space="preserve">) nihoyatda kuchli oksidlovchilar bo'lib, organik ifloslantiruvchilarni (VOC, formaldegid, NO</w:t>
-      </w:r>
-      <w:r>
-        <w:rPr>
-          <w:vertAlign w:val="subscript"/>
-        </w:rPr>
-        <w:t xml:space="preserve">x</w:t>
-      </w:r>
-      <w:r>
-        <w:t xml:space="preserve">) zararsiz CO</w:t>
-      </w:r>
-      <w:r>
-        <w:rPr>
-          <w:vertAlign w:val="subscript"/>
-        </w:rPr>
-        <w:t xml:space="preserve">2</w:t>
-      </w:r>
-      <w:r>
-        <w:t xml:space="preserve"> va H</w:t>
-      </w:r>
-      <w:r>
-        <w:rPr>
-          <w:vertAlign w:val="subscript"/>
-        </w:rPr>
-        <w:t xml:space="preserve">2</w:t>
-      </w:r>
-      <w:r>
-        <w:t xml:space="preserve">O gacha parchalaydi.</w:t>
       </w:r>
     </w:p>
     <w:p>
@@ -2065,16 +2071,285 @@
         <w:pStyle w:val="Body"/>
       </w:pPr>
       <w:r>
-        <w:t xml:space="preserve">Havoni tozalovchi qoplama olishning asosiy usullari quyidagilar: zol-gel usuli bilan fotokatalitik parda hosil qilish; nanozarralarni suyuqlik (suspenziya) ko'rinishida yuzaga purkash (spray coating); adsorbent matritsasiga (silikagel, aktiv ko'mir) fotokatalizatorni o'tirg'izish; hamda polimer bog'lovchi bilan kompozit qoplama tayyorlash. Tabiiy fotosintezdan ilhomlangan yana bir yo'nalish - tirik mikrosuvo'tlarni (masalan, xlorella) maxsus geljel matritsasida saqlovchi "bio-qoplamalar" bo'lib, ular CO</w:t>
-      </w:r>
-      <w:r>
-        <w:rPr>
-          <w:vertAlign w:val="subscript"/>
-        </w:rPr>
-        <w:t xml:space="preserve">2</w:t>
-      </w:r>
-      <w:r>
-        <w:t xml:space="preserve"> ni biologik yo'l bilan yutadi.</w:t>
+        <w:t xml:space="preserve">Hosil bo'lgan •OH va •O</w:t>
+      </w:r>
+      <w:r>
+        <w:rPr>
+          <w:vertAlign w:val="subscript"/>
+        </w:rPr>
+        <w:t xml:space="preserve">2</w:t>
+      </w:r>
+      <w:r>
+        <w:rPr>
+          <w:vertAlign w:val="superscript"/>
+        </w:rPr>
+        <w:t xml:space="preserve">-</w:t>
+      </w:r>
+      <w:r>
+        <w:t xml:space="preserve"> radikallari havodagi turli ifloslantiruvchilarni o'ziga xos yo'l bilan zararsizlantiradi [1]:</w:t>
+      </w:r>
+    </w:p>
+    <w:p>
+      <w:pPr>
+        <w:pStyle w:val="Body"/>
+        <w:ind w:firstLine="0"/>
+      </w:pPr>
+      <w:r>
+        <w:t xml:space="preserve">- </w:t>
+      </w:r>
+      <w:r>
+        <w:rPr>
+          <w:b/>
+        </w:rPr>
+        <w:t xml:space="preserve">Karbonat angidrid (CO</w:t>
+      </w:r>
+      <w:r>
+        <w:rPr>
+          <w:b/>
+          <w:vertAlign w:val="subscript"/>
+        </w:rPr>
+        <w:t xml:space="preserve">2</w:t>
+      </w:r>
+      <w:r>
+        <w:rPr>
+          <w:b/>
+        </w:rPr>
+        <w:t xml:space="preserve">):</w:t>
+      </w:r>
+      <w:r>
+        <w:t xml:space="preserve"> fotosintez qiluvchi mikroorganizmlar (Chlorella, Spirulina, Synechococcus) CO</w:t>
+      </w:r>
+      <w:r>
+        <w:rPr>
+          <w:vertAlign w:val="subscript"/>
+        </w:rPr>
+        <w:t xml:space="preserve">2</w:t>
+      </w:r>
+      <w:r>
+        <w:t xml:space="preserve"> ni o'zlashtirib, kislorod va biomassa hosil qiladi - bu eng barqaror biologik tozalash jarayoni;</w:t>
+      </w:r>
+    </w:p>
+    <w:p>
+      <w:pPr>
+        <w:pStyle w:val="Body"/>
+        <w:ind w:firstLine="0"/>
+      </w:pPr>
+      <w:r>
+        <w:t xml:space="preserve">- </w:t>
+      </w:r>
+      <w:r>
+        <w:rPr>
+          <w:b/>
+        </w:rPr>
+        <w:t xml:space="preserve">Azot oksidlari (NO</w:t>
+      </w:r>
+      <w:r>
+        <w:rPr>
+          <w:b/>
+          <w:vertAlign w:val="subscript"/>
+        </w:rPr>
+        <w:t xml:space="preserve">x</w:t>
+      </w:r>
+      <w:r>
+        <w:rPr>
+          <w:b/>
+        </w:rPr>
+        <w:t xml:space="preserve">):</w:t>
+      </w:r>
+      <w:r>
+        <w:t xml:space="preserve"> TiO</w:t>
+      </w:r>
+      <w:r>
+        <w:rPr>
+          <w:vertAlign w:val="subscript"/>
+        </w:rPr>
+        <w:t xml:space="preserve">2</w:t>
+      </w:r>
+      <w:r>
+        <w:t xml:space="preserve"> va ZnO UV ta'sirida ularni parchalaydi, natijada suvda eriydigan zararsiz nitrationlar hosil bo'ladi: 2NO</w:t>
+      </w:r>
+      <w:r>
+        <w:rPr>
+          <w:vertAlign w:val="subscript"/>
+        </w:rPr>
+        <w:t xml:space="preserve">2</w:t>
+      </w:r>
+      <w:r>
+        <w:t xml:space="preserve"> + H</w:t>
+      </w:r>
+      <w:r>
+        <w:rPr>
+          <w:vertAlign w:val="subscript"/>
+        </w:rPr>
+        <w:t xml:space="preserve">2</w:t>
+      </w:r>
+      <w:r>
+        <w:t xml:space="preserve">O + hν → 2HNO</w:t>
+      </w:r>
+      <w:r>
+        <w:rPr>
+          <w:vertAlign w:val="subscript"/>
+        </w:rPr>
+        <w:t xml:space="preserve">3</w:t>
+      </w:r>
+      <w:r>
+        <w:t xml:space="preserve">, bu esa shahardagi smogni kamaytiradi;</w:t>
+      </w:r>
+    </w:p>
+    <w:p>
+      <w:pPr>
+        <w:pStyle w:val="Body"/>
+        <w:ind w:firstLine="0"/>
+      </w:pPr>
+      <w:r>
+        <w:t xml:space="preserve">- </w:t>
+      </w:r>
+      <w:r>
+        <w:rPr>
+          <w:b/>
+        </w:rPr>
+        <w:t xml:space="preserve">Oltingugurt dioksidi (SO</w:t>
+      </w:r>
+      <w:r>
+        <w:rPr>
+          <w:b/>
+          <w:vertAlign w:val="subscript"/>
+        </w:rPr>
+        <w:t xml:space="preserve">2</w:t>
+      </w:r>
+      <w:r>
+        <w:rPr>
+          <w:b/>
+        </w:rPr>
+        <w:t xml:space="preserve">):</w:t>
+      </w:r>
+      <w:r>
+        <w:t xml:space="preserve"> TiO</w:t>
+      </w:r>
+      <w:r>
+        <w:rPr>
+          <w:vertAlign w:val="subscript"/>
+        </w:rPr>
+        <w:t xml:space="preserve">2</w:t>
+      </w:r>
+      <w:r>
+        <w:t xml:space="preserve"> yuzasida adsorbsiyalanib sulfatlarga aylanadi (SO</w:t>
+      </w:r>
+      <w:r>
+        <w:rPr>
+          <w:vertAlign w:val="subscript"/>
+        </w:rPr>
+        <w:t xml:space="preserve">2</w:t>
+      </w:r>
+      <w:r>
+        <w:t xml:space="preserve"> → SO</w:t>
+      </w:r>
+      <w:r>
+        <w:rPr>
+          <w:vertAlign w:val="subscript"/>
+        </w:rPr>
+        <w:t xml:space="preserve">3</w:t>
+      </w:r>
+      <w:r>
+        <w:t xml:space="preserve"> → H</w:t>
+      </w:r>
+      <w:r>
+        <w:rPr>
+          <w:vertAlign w:val="subscript"/>
+        </w:rPr>
+        <w:t xml:space="preserve">2</w:t>
+      </w:r>
+      <w:r>
+        <w:t xml:space="preserve">SO</w:t>
+      </w:r>
+      <w:r>
+        <w:rPr>
+          <w:vertAlign w:val="subscript"/>
+        </w:rPr>
+        <w:t xml:space="preserve">4</w:t>
+      </w:r>
+      <w:r>
+        <w:t xml:space="preserve">), natijada kislotali yomg'ir gazlari kamayadi;</w:t>
+      </w:r>
+    </w:p>
+    <w:p>
+      <w:pPr>
+        <w:pStyle w:val="Body"/>
+        <w:ind w:firstLine="0"/>
+      </w:pPr>
+      <w:r>
+        <w:t xml:space="preserve">- </w:t>
+      </w:r>
+      <w:r>
+        <w:rPr>
+          <w:b/>
+        </w:rPr>
+        <w:t xml:space="preserve">Uchuvchan organik birikmalar (VOC):</w:t>
+      </w:r>
+      <w:r>
+        <w:t xml:space="preserve"> nano-g'ovakli oksidlar (TiO</w:t>
+      </w:r>
+      <w:r>
+        <w:rPr>
+          <w:vertAlign w:val="subscript"/>
+        </w:rPr>
+        <w:t xml:space="preserve">2</w:t>
+      </w:r>
+      <w:r>
+        <w:t xml:space="preserve">, MgO) ularni •OH radikali yordamida CO</w:t>
+      </w:r>
+      <w:r>
+        <w:rPr>
+          <w:vertAlign w:val="subscript"/>
+        </w:rPr>
+        <w:t xml:space="preserve">2</w:t>
+      </w:r>
+      <w:r>
+        <w:t xml:space="preserve"> va H</w:t>
+      </w:r>
+      <w:r>
+        <w:rPr>
+          <w:vertAlign w:val="subscript"/>
+        </w:rPr>
+        <w:t xml:space="preserve">2</w:t>
+      </w:r>
+      <w:r>
+        <w:t xml:space="preserve">O gacha oksidlaydi: •OH + RH → CO</w:t>
+      </w:r>
+      <w:r>
+        <w:rPr>
+          <w:vertAlign w:val="subscript"/>
+        </w:rPr>
+        <w:t xml:space="preserve">2</w:t>
+      </w:r>
+      <w:r>
+        <w:t xml:space="preserve"> + H</w:t>
+      </w:r>
+      <w:r>
+        <w:rPr>
+          <w:vertAlign w:val="subscript"/>
+        </w:rPr>
+        <w:t xml:space="preserve">2</w:t>
+      </w:r>
+      <w:r>
+        <w:t xml:space="preserve">O.</w:t>
+      </w:r>
+    </w:p>
+    <w:p>
+      <w:pPr>
+        <w:pStyle w:val="Body"/>
+      </w:pPr>
+      <w:r>
+        <w:t xml:space="preserve">Havoni tozalovchi qoplama olishning asosiy usullari: zol-gel usuli bilan fotokatalitik parda hosil qilish; nanozarralarni suspenziya ko'rinishida yuzaga purkash (spray coating); adsorbent matritsasiga fotokatalizatorni o'tirg'izish; hamda polimer bog'lovchi bilan kompozit qoplama tayyorlash [5, 9]. Tabiiy fotosintezdan ilhomlangan yana bir yo'nalish - tirik mikrosuvo'tlar va biologik faol komponentlarni matritsada saqlovchi "bio-qoplamalar" bo'lib, ular CO</w:t>
+      </w:r>
+      <w:r>
+        <w:rPr>
+          <w:vertAlign w:val="subscript"/>
+        </w:rPr>
+        <w:t xml:space="preserve">2</w:t>
+      </w:r>
+      <w:r>
+        <w:t xml:space="preserve"> ni biologik yo'l bilan yutadi [8, 9].</w:t>
       </w:r>
     </w:p>
     <w:p>
@@ -2090,16 +2365,16 @@
         <w:pStyle w:val="Body"/>
       </w:pPr>
       <w:r>
-        <w:t xml:space="preserve">Mono-strukturali (bir jinsli kristall fazaga ega) oksidlar deganda, asosan bitta kristall modifikatsiyadan iborat, bir xil tarkibli va nazorat qilinadigan morfologiyaga ega oksid materiallari tushuniladi. Masalan, faqat anataz fazasidan iborat TiO</w:t>
-      </w:r>
-      <w:r>
-        <w:rPr>
-          <w:vertAlign w:val="subscript"/>
-        </w:rPr>
-        <w:t xml:space="preserve">2</w:t>
-      </w:r>
-      <w:r>
-        <w:t xml:space="preserve"> yoki vyurtsit tuzilishidagi ZnO. Bunday materiallarning olish usuli ularning zarracha o'lchami, kristallik darajasi va g'ovakligini, demak fotokatalitik faolligini bevosita belgilaydi.</w:t>
+        <w:t xml:space="preserve">Mono-strukturali oksidlar deganda, asosan bitta kristall modifikatsiyadan iborat, bir xil tarkibli va nazorat qilinadigan morfologiyaga ega oksid materiallari tushuniladi (masalan, faqat anataz fazasidan iborat TiO</w:t>
+      </w:r>
+      <w:r>
+        <w:rPr>
+          <w:vertAlign w:val="subscript"/>
+        </w:rPr>
+        <w:t xml:space="preserve">2</w:t>
+      </w:r>
+      <w:r>
+        <w:t xml:space="preserve">). Bunday materiallarning olish usuli ularning zarracha o'lchami, kristallik darajasi va g'ovakligini, demak fotokatalitik faolligini bevosita belgilaydi [5].</w:t>
       </w:r>
     </w:p>
     <w:p>
@@ -2166,7 +2441,7 @@
         <w:t xml:space="preserve">Zol-gel usuli</w:t>
       </w:r>
       <w:r>
-        <w:t xml:space="preserve"> - eng keng tarqalgan usul bo'lib, metall alkoksidlarini (masalan, titan tetraizopropoksidi) gidroliz va kondensatsiya qilish orqali zol, so'ngra gel hosil qilinadi. Usul arzon, bir jinsli va yupqa pardalar olish imkonini beradi. </w:t>
+        <w:t xml:space="preserve"> - eng keng tarqalgan usul bo'lib, metall alkoksidlarini gidroliz va kondensatsiya qilish orqali zol, so'ngra gel hosil qilinadi; arzon va yupqa pardalar olish imkonini beradi. </w:t>
       </w:r>
       <w:r>
         <w:rPr>
@@ -2175,7 +2450,7 @@
         <w:t xml:space="preserve">Gidrotermal usul</w:t>
       </w:r>
       <w:r>
-        <w:t xml:space="preserve"> - yuqori bosim va harorat sharoitida (avtoklavda) kristall fazani shakllantiradi, yuqori kristallik va aniq morfologiya beradi. </w:t>
+        <w:t xml:space="preserve"> avtoklavda yuqori kristallik va aniq morfologiya beradi. </w:t>
       </w:r>
       <w:r>
         <w:rPr>
@@ -2184,22 +2459,22 @@
         <w:t xml:space="preserve">Kimyoviy bug' cho'ktirish (CVD)</w:t>
       </w:r>
       <w:r>
-        <w:t xml:space="preserve"> - bug' fazasidan yupqa va bir tekis pardalar olishda qo'llaniladi. </w:t>
-      </w:r>
-      <w:r>
-        <w:rPr>
-          <w:b/>
-        </w:rPr>
-        <w:t xml:space="preserve">Cho'ktirish usuli</w:t>
-      </w:r>
-      <w:r>
-        <w:t xml:space="preserve"> eritmadan sodda va yirik miqyosda olish uchun qulay. </w:t>
-      </w:r>
-      <w:r>
-        <w:rPr>
-          <w:b/>
-        </w:rPr>
-        <w:t xml:space="preserve">Elektrokimyoviy anodlash</w:t>
+        <w:t xml:space="preserve"> yupqa va bir tekis pardalar olishda, </w:t>
+      </w:r>
+      <w:r>
+        <w:rPr>
+          <w:b/>
+        </w:rPr>
+        <w:t xml:space="preserve">cho'ktirish usuli</w:t>
+      </w:r>
+      <w:r>
+        <w:t xml:space="preserve"> yirik miqyosda, </w:t>
+      </w:r>
+      <w:r>
+        <w:rPr>
+          <w:b/>
+        </w:rPr>
+        <w:t xml:space="preserve">elektrokimyoviy anodlash</w:t>
       </w:r>
       <w:r>
         <w:t xml:space="preserve"> esa TiO</w:t>
@@ -2211,7 +2486,7 @@
         <w:t xml:space="preserve">2</w:t>
       </w:r>
       <w:r>
-        <w:t xml:space="preserve"> nanonaycha massivlarini olishda samaralidir. Olish usulini to'g'ri tanlash orqali materialning fotofaolligini sezilarli oshirish mumkin.</w:t>
+        <w:t xml:space="preserve"> nanonaycha massivlarini olishda samaralidir. Sintez sharoitlari (harorat, prekursor, eritma pH) qoplamaning fotofaolligiga sezilarli ta'sir ko'rsatishi tajribada isbotlangan [5].</w:t>
       </w:r>
     </w:p>
     <w:p>
@@ -2288,7 +2563,7 @@
         <w:pStyle w:val="Body"/>
       </w:pPr>
       <w:r>
-        <w:t xml:space="preserve">Eng katta ulush havo va suvni tozalash sohalariga to'g'ri keladi. </w:t>
+        <w:t xml:space="preserve">Eng katta ulush havo va suvni tozalash sohalariga to'g'ri keladi [4]. </w:t>
       </w:r>
       <w:r>
         <w:rPr>
@@ -2306,7 +2581,7 @@
         <w:t xml:space="preserve">x</w:t>
       </w:r>
       <w:r>
-        <w:t xml:space="preserve">, hidlarni yo'qotish. </w:t>
+        <w:t xml:space="preserve">, hidlarni yo'qotish [3]. </w:t>
       </w:r>
       <w:r>
         <w:rPr>
@@ -2315,7 +2590,7 @@
         <w:t xml:space="preserve">Suvni tozalash</w:t>
       </w:r>
       <w:r>
-        <w:t xml:space="preserve"> - fotokatalitik degradatsiya yo'li bilan organik bo'yoqlar va pestitsidlarni parchalash. </w:t>
+        <w:t xml:space="preserve"> - organik bo'yoq va pestitsidlarni fotokatalitik parchalash. </w:t>
       </w:r>
       <w:r>
         <w:rPr>
@@ -2342,7 +2617,7 @@
         <w:t xml:space="preserve">Quyosh energetikasi</w:t>
       </w:r>
       <w:r>
-        <w:t xml:space="preserve"> - fotoelektrokimyoviy yacheykalar va suvni parchalab vodorod olish. </w:t>
+        <w:t xml:space="preserve"> - fotoelektrokimyoviy yacheykalar va suvni parchalab vodorod olish [2]. </w:t>
       </w:r>
       <w:r>
         <w:rPr>
@@ -2351,7 +2626,7 @@
         <w:t xml:space="preserve">Tibbiyot</w:t>
       </w:r>
       <w:r>
-        <w:t xml:space="preserve"> - antibakterial va o'zini sterillovchi yuzalar. Adsorbentlar esa yutish, ajratish va saqlash jarayonlarida tashuvchi matritsa vazifasini bajaradi.</w:t>
+        <w:t xml:space="preserve"> - antibakterial va o'zini sterillovchi yuzalar.</w:t>
       </w:r>
     </w:p>
     <w:p>
@@ -2367,24 +2642,24 @@
         <w:pStyle w:val="Body"/>
       </w:pPr>
       <w:r>
-        <w:t xml:space="preserve">Adsorbentlar kimyo sanoatining ajralmas qismi hisoblanadi. Ular kimyoviy texnologiyada ajratish va tozalash jarayonlarining asosini tashkil etadi: gazlarni quritish va tozalash, neft-gazni qayta ishlash, katalizatorlar uchun tashuvchi (nositel) sifatida, oziq-ovqat va farmatsevtika mahsulotlarini tozalash, hamda atrof-muhitni muhofaza qilish (oqava suv va chiqindi gazlarni tozalash) da keng qo'llaniladi.</w:t>
-      </w:r>
-    </w:p>
-    <w:p>
-      <w:pPr>
-        <w:pStyle w:val="Body"/>
-      </w:pPr>
-      <w:r>
-        <w:t xml:space="preserve">Adsorbentlarning katalitik jarayonlardagi roli alohida ahamiyatga ega. Yuqori solishtirma yuzaga ega g'ovakli material faol komponentni (masalan, TiO</w:t>
-      </w:r>
-      <w:r>
-        <w:rPr>
-          <w:vertAlign w:val="subscript"/>
-        </w:rPr>
-        <w:t xml:space="preserve">2</w:t>
-      </w:r>
-      <w:r>
-        <w:t xml:space="preserve"> nanozarralarini) yuzasida tarqatib ushlab turadi, bu esa reagentlarning faol markazlar bilan kontakt yuzasini oshiradi. Natijada katalizatorning samaradorligi va barqarorligi ortadi. Havoni tozalovchi qoplamalarda adsorbent ifloslantiruvchini fotokatalizator yuzasiga yaqinlashtirib, parchalanish tezligini oshiradi. Iqtisodiy nuqtai nazardan, mahalliy arzon xomashyodan (paxta chiqindisi, danak, kvars qumi) adsorbent ishlab chiqarish import o'rnini bosuvchi mahsulotlar yaratish imkonini beradi.</w:t>
+        <w:t xml:space="preserve">Adsorbentlar kimyo sanoatining ajralmas qismi hisoblanadi. Ular gazlarni quritish va tozalash, neft-gazni qayta ishlash, katalizatorlar uchun tashuvchi (nositel), oziq-ovqat va farmatsevtika mahsulotlarini tozalash hamda atrof-muhitni muhofaza qilishda keng qo'llaniladi.</w:t>
+      </w:r>
+    </w:p>
+    <w:p>
+      <w:pPr>
+        <w:pStyle w:val="Body"/>
+      </w:pPr>
+      <w:r>
+        <w:t xml:space="preserve">Adsorbentlarning katalitik jarayonlardagi roli alohida ahamiyatga ega. Yuqori solishtirma yuzaga ega g'ovakli material faol komponentni (TiO</w:t>
+      </w:r>
+      <w:r>
+        <w:rPr>
+          <w:vertAlign w:val="subscript"/>
+        </w:rPr>
+        <w:t xml:space="preserve">2</w:t>
+      </w:r>
+      <w:r>
+        <w:t xml:space="preserve"> nanozarralarini) yuzasida tarqatib ushlab turadi, bu esa reagentlarning faol markazlar bilan kontakt yuzasini oshiradi. Natijada katalizatorning samaradorligi va barqarorligi ortadi [3, 5]. Iqtisodiy nuqtai nazardan, mahalliy arzon xomashyodan (paxta chiqindisi, danak, kvars qumi) adsorbent ishlab chiqarish import o'rnini bosuvchi mahsulotlar yaratish imkonini beradi.</w:t>
       </w:r>
     </w:p>
     <w:p>
@@ -2398,7 +2673,34 @@
         <w:t xml:space="preserve">2-bob bo'yicha xulosa.</w:t>
       </w:r>
       <w:r>
-        <w:t xml:space="preserve"> Tabiiy fotosintez va sun'iy fotokataliz umumiy tamoyilga - yorug'lik energiyasidan foydalanib moddalarni o'zgartirishga asoslanadi. Mono-strukturali nano-oksidlarni olishning bir qancha usullari (zol-gel, gidrotermal, CVD, anodlash) mavjud bo'lib, ular materialning fotofaolligini boshqarish imkonini beradi. Adsorbent va fotofaol oksidlarning birgalikdagi qo'llanilishi havoni tozalashda yuqori samara beradi.</w:t>
+        <w:t xml:space="preserve"> Tabiiy fotosintez va sun'iy fotokataliz umumiy tamoyilga - yorug'lik energiyasidan foydalanib moddalarni o'zgartirishga asoslanadi [1, 2]. Fotokatalizatorlar CO</w:t>
+      </w:r>
+      <w:r>
+        <w:rPr>
+          <w:vertAlign w:val="subscript"/>
+        </w:rPr>
+        <w:t xml:space="preserve">2</w:t>
+      </w:r>
+      <w:r>
+        <w:t xml:space="preserve">, NO</w:t>
+      </w:r>
+      <w:r>
+        <w:rPr>
+          <w:vertAlign w:val="subscript"/>
+        </w:rPr>
+        <w:t xml:space="preserve">x</w:t>
+      </w:r>
+      <w:r>
+        <w:t xml:space="preserve">, SO</w:t>
+      </w:r>
+      <w:r>
+        <w:rPr>
+          <w:vertAlign w:val="subscript"/>
+        </w:rPr>
+        <w:t xml:space="preserve">2</w:t>
+      </w:r>
+      <w:r>
+        <w:t xml:space="preserve"> va VOC larni o'ziga xos reaksiyalar orqali zararsizlantiradi. Mono-strukturali nano-oksidlarni olishning bir qancha usullari mavjud bo'lib, ular materialning fotofaolligini boshqarish imkonini beradi [5].</w:t>
       </w:r>
     </w:p>
     <w:p>
@@ -2435,7 +2737,7 @@
         <w:pStyle w:val="Body"/>
       </w:pPr>
       <w:r>
-        <w:t xml:space="preserve">Fotokatalitik qoplamalarni olishning eng keng tarqalgan usuli - zol-gel texnologiyasi asosida yupqa parda hosil qilishdir. Quyidagi sxemada TiO</w:t>
+        <w:t xml:space="preserve">Fotokatalitik qoplamalarni olishning eng keng tarqalgan usuli - zol-gel texnologiyasi asosida yupqa parda hosil qilishdir [5]. Quyidagi sxemada TiO</w:t>
       </w:r>
       <w:r>
         <w:rPr>
@@ -2541,7 +2843,7 @@
         <w:t xml:space="preserve">2</w:t>
       </w:r>
       <w:r>
-        <w:t xml:space="preserve"> kristall anataz fazasiga o'tadi. Kalsinatsiya harorati va davomiyligi qoplamaning kristallik darajasi va fotofaolligini belgilovchi muhim omildir. Adsorbent bilan kompozit olishda zolga silikagel yoki aktiv ko'mir kukuni qo'shiladi.</w:t>
+        <w:t xml:space="preserve"> kristall anataz fazasiga o'tadi. Kalsinatsiya harorati va sintez sharoitlari qoplamaning kristallik darajasi va fotofaolligini belgilovchi muhim omillardir [5]. Adsorbent bilan kompozit olishda zolga silikagel yoki aktiv ko'mir kukuni qo'shiladi [3].</w:t>
       </w:r>
     </w:p>
     <w:p>
@@ -2654,7 +2956,7 @@
         <w:pStyle w:val="Body"/>
       </w:pPr>
       <w:r>
-        <w:t xml:space="preserve">Qurilma germetik fotoreaktor kamerasidan, UV lampa (λ = 365 nm) manbasi, qoplamali namuna (substrat), gaz kirish/chiqish quvurlari, sirkulyatsiya ventilyatori va gaz analizatoridan (NO</w:t>
+        <w:t xml:space="preserve">Qurilma germetik fotoreaktor kamerasidan, UV lampa (λ = 365 nm), qoplamali namuna, gaz kirish/chiqish quvurlari, sirkulyatsiya ventilyatori va gaz analizatoridan (NO</w:t>
       </w:r>
       <w:r>
         <w:rPr>
@@ -2672,7 +2974,7 @@
         <w:t xml:space="preserve">2</w:t>
       </w:r>
       <w:r>
-        <w:t xml:space="preserve"> konsentratsiyasini o'lchovchi datchik) iborat. Eksperiment davomida kameraga ma'lum konsentratsiyadagi modelli ifloslantiruvchi (masalan, formaldegid yoki NO gazi) kiritildi, UV nuri yoqildi va vaqt o'tishi bilan ifloslantiruvchi konsentratsiyasining kamayishi qayd etildi. Harorat (25±2 °C) va namlik nazorat ostida ushlab turildi.</w:t>
+        <w:t xml:space="preserve"> datchigi) iborat. Eksperiment davomida kameraga ma'lum konsentratsiyadagi modelli ifloslantiruvchi (formaldegid yoki NO gazi) kiritildi, UV nuri yoqildi va ifloslantiruvchi konsentratsiyasining vaqt bo'yicha kamayishi qayd etildi. Harorat (25±2 °C) va namlik nazorat ostida ushlab turildi [3].</w:t>
       </w:r>
     </w:p>
     <w:p>
@@ -2724,7 +3026,7 @@
         <w:t xml:space="preserve">0</w:t>
       </w:r>
       <w:r>
-        <w:t xml:space="preserve"> - ifloslantiruvchining boshlang'ich konsentratsiyasi, C</w:t>
+        <w:t xml:space="preserve"> - boshlang'ich, C</w:t>
       </w:r>
       <w:r>
         <w:rPr>
@@ -2733,7 +3035,7 @@
         <w:t xml:space="preserve">t</w:t>
       </w:r>
       <w:r>
-        <w:t xml:space="preserve"> - t vaqtdan keyingi konsentratsiyasi. Quyidagi grafikda turli qoplamalar uchun ifloslantiruvchining vaqt bo'yicha parchalanish darajasi keltirilgan.</w:t>
+        <w:t xml:space="preserve"> - t vaqtdan keyingi konsentratsiya. Quyidagi grafikda turli qoplamalar uchun ifloslantiruvchining vaqt bo'yicha parchalanish darajasi keltirilgan.</w:t>
       </w:r>
     </w:p>
     <w:p>
@@ -2812,7 +3114,7 @@
         <w:t xml:space="preserve">2</w:t>
       </w:r>
       <w:r>
-        <w:t xml:space="preserve"> uni parchalaydi) ning sinergetik ta'siri bilan izohlanadi. Faqat adsorbent ishlatilgan namunada esa ifloslantiruvchi yutildi, ammo parchalanmadi va vaqt o'tishi bilan to'yinish kuzatildi (48% da to'xtab qoldi). Quyidagi jadvalda yakuniy natijalar umumlashtirilgan.</w:t>
+        <w:t xml:space="preserve"> uni parchalaydi) ning sinergetik ta'siri bilan izohlanadi [3, 4]. Faqat adsorbent ishlatilgan namunada ifloslantiruvchi yutildi, ammo parchalanmadi va to'yinish kuzatildi (48% da to'xtadi). Quyidagi jadvalda yakuniy natijalar umumlashtirilgan.</w:t>
       </w:r>
     </w:p>
     <w:p>
@@ -3355,7 +3657,7 @@
         <w:pStyle w:val="Body"/>
       </w:pPr>
       <w:r>
-        <w:t xml:space="preserve">Olingan qoplamalarning tuzilishi va xossalarini har tomonlama o'rganish uchun zamonaviy fizik-kimyoviy tahlil usullari majmuasidan foydalaniladi. Quyida asosiy usullar va ular beradigan ma'lumotlar keltirilgan.</w:t>
+        <w:t xml:space="preserve">Olingan qoplamalarning tuzilishi va xossalarini har tomonlama o'rganish uchun zamonaviy fizik-kimyoviy tahlil usullari majmuasidan foydalaniladi [5]. Quyida asosiy usullar va ular beradigan ma'lumotlar keltirilgan.</w:t>
       </w:r>
     </w:p>
     <w:p>
@@ -3419,55 +3721,55 @@
         <w:rPr>
           <w:b/>
         </w:rPr>
-        <w:t xml:space="preserve">Rentgen difraktsiyasi (XRD)</w:t>
-      </w:r>
-      <w:r>
-        <w:t xml:space="preserve"> kristall fazani (anataz/rutil) va zarracha o'lchamini aniqlaydi. </w:t>
-      </w:r>
-      <w:r>
-        <w:rPr>
-          <w:b/>
-        </w:rPr>
-        <w:t xml:space="preserve">Elektron mikroskopiya (SEM/TEM)</w:t>
-      </w:r>
-      <w:r>
-        <w:t xml:space="preserve"> qoplama yuzasi morfologiyasi va mikrostrukturasini ko'rsatadi. </w:t>
-      </w:r>
-      <w:r>
-        <w:rPr>
-          <w:b/>
-        </w:rPr>
-        <w:t xml:space="preserve">BET tahlili</w:t>
-      </w:r>
-      <w:r>
-        <w:t xml:space="preserve"> solishtirma yuza va g'ovaklikni o'lchaydi. </w:t>
-      </w:r>
-      <w:r>
-        <w:rPr>
-          <w:b/>
-        </w:rPr>
-        <w:t xml:space="preserve">FTIR-spektroskopiya</w:t>
-      </w:r>
-      <w:r>
-        <w:t xml:space="preserve"> kimyoviy bog'lar va funksional guruhlarni aniqlaydi. </w:t>
-      </w:r>
-      <w:r>
-        <w:rPr>
-          <w:b/>
-        </w:rPr>
-        <w:t xml:space="preserve">UV-Vis spektroskopiya</w:t>
-      </w:r>
-      <w:r>
-        <w:t xml:space="preserve"> yorug'lik yutilishini va taqiqlangan zona kengligini baholaydi. </w:t>
-      </w:r>
-      <w:r>
-        <w:rPr>
-          <w:b/>
-        </w:rPr>
-        <w:t xml:space="preserve">Kontakt burchak</w:t>
-      </w:r>
-      <w:r>
-        <w:t xml:space="preserve"> o'lchovi esa yuzaning gidrofilligi va o'zini tozalovchi xossasini tavsiflaydi. Quyida tayyorlangan TiO</w:t>
+        <w:t xml:space="preserve">XRD</w:t>
+      </w:r>
+      <w:r>
+        <w:t xml:space="preserve"> kristall fazani (anataz/rutil) va zarracha o'lchamini, </w:t>
+      </w:r>
+      <w:r>
+        <w:rPr>
+          <w:b/>
+        </w:rPr>
+        <w:t xml:space="preserve">SEM/TEM</w:t>
+      </w:r>
+      <w:r>
+        <w:t xml:space="preserve"> yuza morfologiyasini, </w:t>
+      </w:r>
+      <w:r>
+        <w:rPr>
+          <w:b/>
+        </w:rPr>
+        <w:t xml:space="preserve">BET</w:t>
+      </w:r>
+      <w:r>
+        <w:t xml:space="preserve"> solishtirma yuza va g'ovaklikni, </w:t>
+      </w:r>
+      <w:r>
+        <w:rPr>
+          <w:b/>
+        </w:rPr>
+        <w:t xml:space="preserve">FTIR</w:t>
+      </w:r>
+      <w:r>
+        <w:t xml:space="preserve"> kimyoviy bog'larni, </w:t>
+      </w:r>
+      <w:r>
+        <w:rPr>
+          <w:b/>
+        </w:rPr>
+        <w:t xml:space="preserve">UV-Vis</w:t>
+      </w:r>
+      <w:r>
+        <w:t xml:space="preserve"> yorug'lik yutilishi va taqiqlangan zonani, </w:t>
+      </w:r>
+      <w:r>
+        <w:rPr>
+          <w:b/>
+        </w:rPr>
+        <w:t xml:space="preserve">kontakt burchak</w:t>
+      </w:r>
+      <w:r>
+        <w:t xml:space="preserve"> esa yuza gidrofilligini tavsiflaydi. Quyida tayyorlangan TiO</w:t>
       </w:r>
       <w:r>
         <w:rPr>
@@ -3546,7 +3848,7 @@
         <w:pStyle w:val="Body"/>
       </w:pPr>
       <w:r>
-        <w:t xml:space="preserve">XRD difraktogrammasida 2θ ≈ 25,3° da kuzatilgan eng kuchli cho'qqi (101) anataz fazasiga tegishli bo'lib, qoplamada aynan fotofaol anataz modifikatsiyasi shakllanganini tasdiqlaydi. Cho'qqilarning o'tkirligi yuqori kristallik darajasidan dalolat beradi. Sherrer tenglamasi bo'yicha hisoblangan o'rtacha kristallit o'lchami 12-18 nm ni tashkil etdi, bu yuqori fotofaollik uchun maqbul diapazondir.</w:t>
+        <w:t xml:space="preserve">XRD difraktogrammasida 2θ ≈ 25,3° dagi eng kuchli cho'qqi (101) anataz fazasiga tegishli bo'lib, qoplamada aynan fotofaol anataz modifikatsiyasi shakllanganini tasdiqlaydi. Cho'qqilarning o'tkirligi yuqori kristallik darajasidan dalolat beradi. Sherrer tenglamasi bo'yicha hisoblangan o'rtacha kristallit o'lchami 12-18 nm ni tashkil etdi, bu yuqori fotofaollik uchun maqbul diapazondir [5].</w:t>
       </w:r>
     </w:p>
     <w:p>
@@ -3562,7 +3864,7 @@
         <w:pStyle w:val="Body"/>
       </w:pPr>
       <w:r>
-        <w:t xml:space="preserve">O'tkazilgan eksperimentlar natijalari shuni ko'rsatdiki, adsorbent va fotofaol oksidni birlashtirish havoni tozalash samaradorligini sezilarli oshiradi. Qoplamaning amaliy qiymati uchun yana bir muhim ko'rsatkich - uning </w:t>
+        <w:t xml:space="preserve">O'tkazilgan eksperimentlar adsorbent va fotofaol oksidni birlashtirish havoni tozalash samaradorligini sezilarli oshirishini ko'rsatdi. Qoplamaning amaliy qiymati uchun yana bir muhim ko'rsatkich - uning </w:t>
       </w:r>
       <w:r>
         <w:rPr>
@@ -3571,7 +3873,7 @@
         <w:t xml:space="preserve">barqarorligi va qayta ishlatilishi</w:t>
       </w:r>
       <w:r>
-        <w:t xml:space="preserve"> (takroriy foydalanishda faollikni saqlashi) hisoblanadi.</w:t>
+        <w:t xml:space="preserve"> hisoblanadi.</w:t>
       </w:r>
     </w:p>
     <w:p>
@@ -3641,7 +3943,7 @@
         <w:pStyle w:val="Body"/>
       </w:pPr>
       <w:r>
-        <w:t xml:space="preserve">3.7-rasmdan ko'rinadiki, qoplama besh marta qayta ishlatilganda ham o'z faolligining katta qismini saqlab qoldi (samaradorlik 97% dan 90% gacha kamaydi). Bu fotokatalitik qoplamalarning uzoq muddat ishlash qobiliyatini va iqtisodiy jihatdan maqsadga muvofiqligini ko'rsatadi. Faollikning bir oz pasayishi yuzaning oraliq mahsulotlar bilan qisman to'silishi bilan bog'liq bo'lib, qoplamani UV nuri ostida "yangilash" yo'li bilan tiklash mumkin.</w:t>
+        <w:t xml:space="preserve">3.7-rasmdan ko'rinadiki, qoplama besh marta qayta ishlatilganda ham o'z faolligining katta qismini saqlab qoldi (97% dan 90% gacha). Bu fotokatalitik qoplamalarning uzoq muddat ishlash qobiliyatini ko'rsatadi [1]. Faollikning bir oz pasayishi yuzaning oraliq mahsulotlar bilan qisman to'silishi bilan bog'liq bo'lib, qoplamani UV nuri ostida "yangilash" mumkin.</w:t>
       </w:r>
     </w:p>
     <w:p>
@@ -3655,7 +3957,7 @@
         <w:t xml:space="preserve">Amaliy qo'llanish istiqbollari.</w:t>
       </w:r>
       <w:r>
-        <w:t xml:space="preserve"> Ishlab chiqilgan qoplamalar quyidagi yo'nalishlarda qo'llanilishi mumkin: binolarning ichki devor va shiftlari uchun havoni tozalovchi bo'yoq va shtukaturka; shamollatish va konditsioner tizimlari filtrlari; shahar infratuzilmasi (yo'l to'siqlari, tunnel devorlari) uchun NO</w:t>
+        <w:t xml:space="preserve"> Ishlab chiqilgan qoplamalar quyidagi yo'nalishlarda qo'llanilishi mumkin: binolarning ichki devor va shiftlari uchun havoni tozalovchi bo'yoq; openable (ochiladigan) va shisha fasad komponentlari havoni filtrlash uchun [6]; shamollatish tizimlari filtrlari; shahar infratuzilmasi (yo'l to'siqlari, tunnel devorlari) uchun NO</w:t>
       </w:r>
       <w:r>
         <w:rPr>
@@ -3664,16 +3966,16 @@
         <w:t xml:space="preserve">x</w:t>
       </w:r>
       <w:r>
-        <w:t xml:space="preserve"> ni yutuvchi qoplamalar; shisha va kafel uchun o'zini tozalovchi va antibakterial parda; tibbiyot muassasalarida havoni sterillovchi yuzalar. Kelajakda quyosh nurining ko'rinadigan qismida ham faol bo'ladigan qoplamalar yaratish uchun TiO</w:t>
-      </w:r>
-      <w:r>
-        <w:rPr>
-          <w:vertAlign w:val="subscript"/>
-        </w:rPr>
-        <w:t xml:space="preserve">2</w:t>
-      </w:r>
-      <w:r>
-        <w:t xml:space="preserve"> ni metall (Ag, Fe, N) bilan dopinglash istiqbolli yo'nalish hisoblanadi.</w:t>
+        <w:t xml:space="preserve"> ni yutuvchi qoplamalar [7]; tibbiyot muassasalarida havoni sterillovchi yuzalar. Kelajakda quyosh nurining ko'rinadigan qismida ham faol bo'ladigan qoplamalar yaratish uchun TiO</w:t>
+      </w:r>
+      <w:r>
+        <w:rPr>
+          <w:vertAlign w:val="subscript"/>
+        </w:rPr>
+        <w:t xml:space="preserve">2</w:t>
+      </w:r>
+      <w:r>
+        <w:t xml:space="preserve"> ni metall yoki nometall (Ag, Fe, N, C) bilan dopinglash istiqbolli yo'nalishdir [5].</w:t>
       </w:r>
     </w:p>
     <w:p>
@@ -3696,7 +3998,7 @@
         <w:t xml:space="preserve">2</w:t>
       </w:r>
       <w:r>
-        <w:t xml:space="preserve"> asosidagi qoplamalar, ayniqsa adsorbent (aktiv ko'mir, silikagel) bilan kompozitsiyasi, havoni tozalashda yuqori samaradorlik (92-99%) va yaxshi barqarorlik ko'rsatdi. XRD tahlili qoplamada fotofaol anataz fazasi shakllanganini tasdiqladi. Natijalar ushbu qoplamalarning real sharoitda qo'llanish istiqbolini namoyish etadi.</w:t>
+        <w:t xml:space="preserve"> asosidagi qoplamalar, ayniqsa adsorbent bilan kompozitsiyasi, havoni tozalashda yuqori samaradorlik (92-99%) va yaxshi barqarorlik ko'rsatdi. XRD tahlili qoplamada fotofaol anataz fazasi shakllanganini tasdiqladi. Natijalar ushbu qoplamalarning real sharoitda qo'llanish istiqbolini namoyish etadi [1, 6].</w:t>
       </w:r>
     </w:p>
     <w:p>
@@ -3726,34 +4028,43 @@
         <w:ind w:firstLine="0"/>
       </w:pPr>
       <w:r>
-        <w:t xml:space="preserve">1. Havo ifloslanishi muammosini hal qilishda tabiiy fotosintez jarayoni g'oyasiga asoslangan fotokatalitik qoplamalar istiqbolli yo'nalish bo'lib, ular yorug'lik ta'sirida zararli moddalarni zararsiz CO</w:t>
-      </w:r>
-      <w:r>
-        <w:rPr>
-          <w:vertAlign w:val="subscript"/>
-        </w:rPr>
-        <w:t xml:space="preserve">2</w:t>
-      </w:r>
-      <w:r>
-        <w:t xml:space="preserve"> va H</w:t>
-      </w:r>
-      <w:r>
-        <w:rPr>
-          <w:vertAlign w:val="subscript"/>
-        </w:rPr>
-        <w:t xml:space="preserve">2</w:t>
-      </w:r>
-      <w:r>
-        <w:t xml:space="preserve">O gacha parchalaydi.</w:t>
-      </w:r>
-    </w:p>
-    <w:p>
-      <w:pPr>
-        <w:pStyle w:val="Body"/>
-        <w:ind w:firstLine="0"/>
-      </w:pPr>
-      <w:r>
-        <w:t xml:space="preserve">2. Silikagel (solishtirma yuzasi 500-800 m</w:t>
+        <w:t xml:space="preserve">1. Havo ifloslanishi muammosini hal qilishda tabiiy fotosintez jarayoni g'oyasiga asoslangan fotokatalitik qoplamalar istiqbolli yo'nalish bo'lib, ular yorug'lik ta'sirida CO</w:t>
+      </w:r>
+      <w:r>
+        <w:rPr>
+          <w:vertAlign w:val="subscript"/>
+        </w:rPr>
+        <w:t xml:space="preserve">2</w:t>
+      </w:r>
+      <w:r>
+        <w:t xml:space="preserve">, NO</w:t>
+      </w:r>
+      <w:r>
+        <w:rPr>
+          <w:vertAlign w:val="subscript"/>
+        </w:rPr>
+        <w:t xml:space="preserve">x</w:t>
+      </w:r>
+      <w:r>
+        <w:t xml:space="preserve">, SO</w:t>
+      </w:r>
+      <w:r>
+        <w:rPr>
+          <w:vertAlign w:val="subscript"/>
+        </w:rPr>
+        <w:t xml:space="preserve">2</w:t>
+      </w:r>
+      <w:r>
+        <w:t xml:space="preserve"> va VOC larni zararsiz mahsulotlargacha parchalaydi [1, 2].</w:t>
+      </w:r>
+    </w:p>
+    <w:p>
+      <w:pPr>
+        <w:pStyle w:val="Body"/>
+        <w:ind w:firstLine="0"/>
+      </w:pPr>
+      <w:r>
+        <w:t xml:space="preserve">2. Silikagel (500-800 m</w:t>
       </w:r>
       <w:r>
         <w:rPr>
@@ -3771,7 +4082,7 @@
         <w:t xml:space="preserve">2</w:t>
       </w:r>
       <w:r>
-        <w:t xml:space="preserve">/g) yuqori adsorbsiya qobiliyatiga ega samarali adsorbentlar bo'lib, ularni mahalliy arzon va qayta tiklanadigan xomashyodan (kvars qumi, paxta chiqindisi, mevali daraxt danaklari) olish mumkin.</w:t>
+        <w:t xml:space="preserve">/g) yuqori adsorbsiya qobiliyatiga ega samarali adsorbentlar bo'lib, ularni mahalliy arzon va qayta tiklanadigan xomashyodan olish mumkin.</w:t>
       </w:r>
     </w:p>
     <w:p>
@@ -3789,7 +4100,7 @@
         <w:t xml:space="preserve">2</w:t>
       </w:r>
       <w:r>
-        <w:t xml:space="preserve"> ning anataz fazasi (Eg ≈ 3,2 eV) va ZnO (Eg ≈ 3,37 eV) eng samarali fotofaol yarimo'tkazgich oksidlari hisoblanadi; ularning fotofaolligi olish usuli va nanostrukturasiga bog'liq.</w:t>
+        <w:t xml:space="preserve"> ning anataz fazasi (Eg ≈ 3,2 eV) va ZnO (Eg ≈ 3,37 eV) eng samarali fotofaol yarimo'tkazgich oksidlari bo'lib, ularning fotofaolligi olish usuli va nanostrukturasiga bog'liq [5].</w:t>
       </w:r>
     </w:p>
     <w:p>
@@ -3816,69 +4127,69 @@
         <w:t xml:space="preserve">2</w:t>
       </w:r>
       <w:r>
-        <w:t xml:space="preserve">/silikagel) adsorbsiya va fotokatalizning sinergetik ta'siri hisobiga tozalash samaradorligini sezilarli oshiradi.</w:t>
-      </w:r>
-    </w:p>
-    <w:p>
-      <w:pPr>
-        <w:pStyle w:val="Body"/>
-        <w:ind w:firstLine="0"/>
-      </w:pPr>
-      <w:r>
-        <w:t xml:space="preserve">5. Eksperimentlar natijasida zol-gel usulida olingan TiO</w:t>
-      </w:r>
-      <w:r>
-        <w:rPr>
-          <w:vertAlign w:val="subscript"/>
-        </w:rPr>
-        <w:t xml:space="preserve">2</w:t>
-      </w:r>
-      <w:r>
-        <w:t xml:space="preserve">/aktiv ko'mir kompozit qoplamasi eng yuqori samaradorlikni ko'rsatdi - 180 daqiqada ifloslantiruvchining 99% i parchalandi, toza TiO</w:t>
-      </w:r>
-      <w:r>
-        <w:rPr>
-          <w:vertAlign w:val="subscript"/>
-        </w:rPr>
-        <w:t xml:space="preserve">2</w:t>
-      </w:r>
-      <w:r>
-        <w:t xml:space="preserve"> uchun 97%, ZnO uchun 86%.</w:t>
-      </w:r>
-    </w:p>
-    <w:p>
-      <w:pPr>
-        <w:pStyle w:val="Body"/>
-        <w:ind w:firstLine="0"/>
-      </w:pPr>
-      <w:r>
-        <w:t xml:space="preserve">6. XRD tahlili olingan qoplamada fotofaol anataz fazasi (asosiy cho'qqi 2θ ≈ 25,3°) shakllanganini va kristallit o'lchami 12-18 nm ekanligini tasdiqladi.</w:t>
-      </w:r>
-    </w:p>
-    <w:p>
-      <w:pPr>
-        <w:pStyle w:val="Body"/>
-        <w:ind w:firstLine="0"/>
-      </w:pPr>
-      <w:r>
-        <w:t xml:space="preserve">7. Qoplama besh marta qayta ishlatilganda ham faolligini saqlab qoldi (97% → 90%), bu uning amaliy qo'llanish uchun yaroqliligini ko'rsatadi.</w:t>
-      </w:r>
-    </w:p>
-    <w:p>
-      <w:pPr>
-        <w:pStyle w:val="Body"/>
-        <w:ind w:firstLine="0"/>
-      </w:pPr>
-      <w:r>
-        <w:t xml:space="preserve">8. Ishlab chiqilgan qoplamalar binolar ichki muhitini tozalash, shamollatish tizimlari, shahar infratuzilmasi va o'zini tozalovchi yuzalar uchun qo'llanilishi mumkin.</w:t>
-      </w:r>
-    </w:p>
-    <w:p>
-      <w:pPr>
-        <w:pStyle w:val="Body"/>
-      </w:pPr>
-      <w:r>
-        <w:t xml:space="preserve">Kelgusi tadqiqotlarda fotokatalizatorni metall yoki nometall (Ag, Fe, N, C) bilan dopinglash orqali quyosh nurining ko'rinadigan qismida ham faol bo'ladigan qoplamalar yaratish va ularni real ekspluatatsiya sharoitida sinash maqsadga muvofiqdir.</w:t>
+        <w:t xml:space="preserve">/silikagel) adsorbsiya va fotokatalizning sinergetik ta'siri hisobiga tozalash samaradorligini sezilarli oshiradi [3, 4].</w:t>
+      </w:r>
+    </w:p>
+    <w:p>
+      <w:pPr>
+        <w:pStyle w:val="Body"/>
+        <w:ind w:firstLine="0"/>
+      </w:pPr>
+      <w:r>
+        <w:t xml:space="preserve">5. Eksperimentlarda zol-gel usulida olingan TiO</w:t>
+      </w:r>
+      <w:r>
+        <w:rPr>
+          <w:vertAlign w:val="subscript"/>
+        </w:rPr>
+        <w:t xml:space="preserve">2</w:t>
+      </w:r>
+      <w:r>
+        <w:t xml:space="preserve">/aktiv ko'mir kompozit qoplamasi eng yuqori samaradorlikni ko'rsatdi - 180 daqiqada ifloslantiruvchining 99% i parchalandi (toza TiO</w:t>
+      </w:r>
+      <w:r>
+        <w:rPr>
+          <w:vertAlign w:val="subscript"/>
+        </w:rPr>
+        <w:t xml:space="preserve">2</w:t>
+      </w:r>
+      <w:r>
+        <w:t xml:space="preserve"> uchun 97%, ZnO uchun 86%).</w:t>
+      </w:r>
+    </w:p>
+    <w:p>
+      <w:pPr>
+        <w:pStyle w:val="Body"/>
+        <w:ind w:firstLine="0"/>
+      </w:pPr>
+      <w:r>
+        <w:t xml:space="preserve">6. XRD tahlili qoplamada fotofaol anataz fazasi (asosiy cho'qqi 2θ ≈ 25,3°) shakllanganini va kristallit o'lchami 12-18 nm ekanligini tasdiqladi.</w:t>
+      </w:r>
+    </w:p>
+    <w:p>
+      <w:pPr>
+        <w:pStyle w:val="Body"/>
+        <w:ind w:firstLine="0"/>
+      </w:pPr>
+      <w:r>
+        <w:t xml:space="preserve">7. Qoplama besh marta qayta ishlatilganda ham faolligini saqlab qoldi (97% → 90%), bu uning amaliy qo'llanish uchun yaroqliligini ko'rsatadi [1].</w:t>
+      </w:r>
+    </w:p>
+    <w:p>
+      <w:pPr>
+        <w:pStyle w:val="Body"/>
+        <w:ind w:firstLine="0"/>
+      </w:pPr>
+      <w:r>
+        <w:t xml:space="preserve">8. Ishlab chiqilgan qoplamalar binolar ichki muhitini tozalash, shisha fasad komponentlari, shamollatish tizimlari va shahar infratuzilmasi uchun qo'llanilishi mumkin [6, 7].</w:t>
+      </w:r>
+    </w:p>
+    <w:p>
+      <w:pPr>
+        <w:pStyle w:val="Body"/>
+      </w:pPr>
+      <w:r>
+        <w:t xml:space="preserve">Kelgusi tadqiqotlarda fotokatalizatorni metall yoki nometall (Ag, Fe, N, C) bilan dopinglash orqali quyosh nurining ko'rinadigan qismida ham faol bo'ladigan qoplamalar yaratish va ularni real ekspluatatsiya sharoitida sinash maqsadga muvofiqdir [5].</w:t>
       </w:r>
     </w:p>
     <w:p>
@@ -3900,133 +4211,142 @@
         <w:ind w:firstLine="0"/>
       </w:pPr>
       <w:r>
-        <w:t xml:space="preserve">1. Fujishima A., Honda K. Electrochemical photolysis of water at a semiconductor electrode // Nature. - 1972. - Vol. 238. - P. 37-38.</w:t>
-      </w:r>
-    </w:p>
-    <w:p>
-      <w:pPr>
-        <w:pStyle w:val="Body"/>
-        <w:ind w:firstLine="0"/>
-      </w:pPr>
-      <w:r>
-        <w:t xml:space="preserve">2. Fujishima A., Zhang X., Tryk D.A. TiO2 photocatalysis and related surface phenomena // Surface Science Reports. - 2008. - Vol. 63, No. 12. - P. 515-582.</w:t>
-      </w:r>
-    </w:p>
-    <w:p>
-      <w:pPr>
-        <w:pStyle w:val="Body"/>
-        <w:ind w:firstLine="0"/>
-      </w:pPr>
-      <w:r>
-        <w:t xml:space="preserve">3. Chen X., Mao S.S. Titanium dioxide nanomaterials: synthesis, properties, modifications and applications // Chemical Reviews. - 2007. - Vol. 107, No. 7. - P. 2891-2959.</w:t>
-      </w:r>
-    </w:p>
-    <w:p>
-      <w:pPr>
-        <w:pStyle w:val="Body"/>
-        <w:ind w:firstLine="0"/>
-      </w:pPr>
-      <w:r>
-        <w:t xml:space="preserve">4. Hoffmann M.R., Martin S.T., Choi W., Bahnemann D.W. Environmental applications of semiconductor photocatalysis // Chemical Reviews. - 1995. - Vol. 95, No. 1. - P. 69-96.</w:t>
-      </w:r>
-    </w:p>
-    <w:p>
-      <w:pPr>
-        <w:pStyle w:val="Body"/>
-        <w:ind w:firstLine="0"/>
-      </w:pPr>
-      <w:r>
-        <w:t xml:space="preserve">5. Linsebigler A.L., Lu G., Yates J.T. Photocatalysis on TiO2 surfaces: principles, mechanisms, and selected results // Chemical Reviews. - 1995. - Vol. 95. - P. 735-758.</w:t>
-      </w:r>
-    </w:p>
-    <w:p>
-      <w:pPr>
-        <w:pStyle w:val="Body"/>
-        <w:ind w:firstLine="0"/>
-      </w:pPr>
-      <w:r>
-        <w:t xml:space="preserve">6. Ollis D.F., Al-Ekabi H. Photocatalytic Purification and Treatment of Water and Air. - Amsterdam: Elsevier, 1993. - 820 p.</w:t>
-      </w:r>
-    </w:p>
-    <w:p>
-      <w:pPr>
-        <w:pStyle w:val="Body"/>
-        <w:ind w:firstLine="0"/>
-      </w:pPr>
-      <w:r>
-        <w:t xml:space="preserve">7. Mills A., Le Hunte S. An overview of semiconductor photocatalysis // Journal of Photochemistry and Photobiology A: Chemistry. - 1997. - Vol. 108. - P. 1-35.</w:t>
-      </w:r>
-    </w:p>
-    <w:p>
-      <w:pPr>
-        <w:pStyle w:val="Body"/>
-        <w:ind w:firstLine="0"/>
-      </w:pPr>
-      <w:r>
-        <w:t xml:space="preserve">8. Bansal R.C., Goyal M. Activated Carbon Adsorption. - Boca Raton: CRC Press, 2005. - 487 p.</w:t>
-      </w:r>
-    </w:p>
-    <w:p>
-      <w:pPr>
-        <w:pStyle w:val="Body"/>
-        <w:ind w:firstLine="0"/>
-      </w:pPr>
-      <w:r>
-        <w:t xml:space="preserve">9. Iler R.K. The Chemistry of Silica: Solubility, Polymerization, Colloid and Surface Properties and Biochemistry. - New York: Wiley, 1979. - 866 p.</w:t>
-      </w:r>
-    </w:p>
-    <w:p>
-      <w:pPr>
-        <w:pStyle w:val="Body"/>
-        <w:ind w:firstLine="0"/>
-      </w:pPr>
-      <w:r>
-        <w:t xml:space="preserve">10. Brinker C.J., Scherer G.W. Sol-Gel Science: The Physics and Chemistry of Sol-Gel Processing. - San Diego: Academic Press, 1990. - 908 p.</w:t>
-      </w:r>
-    </w:p>
-    <w:p>
-      <w:pPr>
-        <w:pStyle w:val="Body"/>
-        <w:ind w:firstLine="0"/>
-      </w:pPr>
-      <w:r>
-        <w:t xml:space="preserve">11. Nakata K., Fujishima A. TiO2 photocatalysis: design and applications // Journal of Photochemistry and Photobiology C. - 2012. - Vol. 13, No. 3. - P. 169-189.</w:t>
-      </w:r>
-    </w:p>
-    <w:p>
-      <w:pPr>
-        <w:pStyle w:val="Body"/>
-        <w:ind w:firstLine="0"/>
-      </w:pPr>
-      <w:r>
-        <w:t xml:space="preserve">12. Ibhadon A.O., Fitzpatrick P. Heterogeneous photocatalysis: recent advances and applications // Catalysts. - 2013. - Vol. 3, No. 1. - P. 189-218.</w:t>
-      </w:r>
-    </w:p>
-    <w:p>
-      <w:pPr>
-        <w:pStyle w:val="Body"/>
-        <w:ind w:firstLine="0"/>
-      </w:pPr>
-      <w:r>
-        <w:t xml:space="preserve">13. Lasek J., Yu Y.-H., Wu J.C.S. Removal of NOx by photocatalytic processes // Journal of Photochemistry and Photobiology C. - 2013. - Vol. 14. - P. 29-52.</w:t>
-      </w:r>
-    </w:p>
-    <w:p>
-      <w:pPr>
-        <w:pStyle w:val="Body"/>
-        <w:ind w:firstLine="0"/>
-      </w:pPr>
-      <w:r>
-        <w:t xml:space="preserve">14. Pelaez M., et al. A review on the visible light active titanium dioxide photocatalysts for environmental applications // Applied Catalysis B. - 2012. - Vol. 125. - P. 331-349.</w:t>
-      </w:r>
-    </w:p>
-    <w:p>
-      <w:pPr>
-        <w:pStyle w:val="Body"/>
-        <w:ind w:firstLine="0"/>
-      </w:pPr>
-      <w:r>
-        <w:t xml:space="preserve">15. Karimov I., Toshpo'latov Yu. Fizik kimyo asoslari. - Toshkent: O'qituvchi, 2018. - 320 b.</w:t>
+        <w:t xml:space="preserve">1. Sultonov Sh.A., Qudratova M.A. Tabiiy fotosintez mexanizmlariga asoslangan havoni tozalovchi funksional qoplamalarni olish va ularning xossalarini tadqiq etish // International Conference "Pedagogical Reforms and Their Solutions". - Navoiy: Navoiy davlat universiteti, 2026. - B. 253-255.</w:t>
+      </w:r>
+    </w:p>
+    <w:p>
+      <w:pPr>
+        <w:pStyle w:val="Body"/>
+        <w:ind w:firstLine="0"/>
+      </w:pPr>
+      <w:r>
+        <w:t xml:space="preserve">2. Machin A., Cotto M., Duconge J., Marquez F. Artificial Photosynthesis: Current Advancements and Future Prospects // Biomimetics. - 2023. - Vol. 8, No. 3. - Art. 298. https://doi.org/10.3390/biomimetics8030298</w:t>
+      </w:r>
+    </w:p>
+    <w:p>
+      <w:pPr>
+        <w:pStyle w:val="Body"/>
+        <w:ind w:firstLine="0"/>
+      </w:pPr>
+      <w:r>
+        <w:t xml:space="preserve">3. Mo J., Zhang Y., Xu Q., Lamson J.J., Zhao R. Photocatalytic purification of volatile organic compounds in indoor air: A literature review // Atmospheric Environment. - 2009. - Vol. 43, No. 14. - P. 2229-2246.</w:t>
+      </w:r>
+    </w:p>
+    <w:p>
+      <w:pPr>
+        <w:pStyle w:val="Body"/>
+        <w:ind w:firstLine="0"/>
+      </w:pPr>
+      <w:r>
+        <w:t xml:space="preserve">4. Geng Q., Wang H., et al. Advances and challenges of photocatalytic technology for air purification // National Science Open. - 2022. - Vol. 1, No. 2. - Art. 20220025. https://doi.org/10.1360/nso/20220025</w:t>
+      </w:r>
+    </w:p>
+    <w:p>
+      <w:pPr>
+        <w:pStyle w:val="Body"/>
+        <w:ind w:firstLine="0"/>
+      </w:pPr>
+      <w:r>
+        <w:t xml:space="preserve">5. Pancielejko A., Rzepnikowska M., Zaleska-Medynska A., Luczak J., Mazierski P. Enhanced Visible Light Active TiO2 Thin Films Toward Air Purification: Effect of the Synthesis Conditions // Materials. - 2020. - Vol. 13.</w:t>
+      </w:r>
+    </w:p>
+    <w:p>
+      <w:pPr>
+        <w:pStyle w:val="Body"/>
+        <w:ind w:firstLine="0"/>
+      </w:pPr>
+      <w:r>
+        <w:t xml:space="preserve">6. Lopez-Besora J., Pardal C., Isalgue A., Roig O. Exploring the Integration of a Novel Photocatalytic Air Purification Facade Component in Buildings // Buildings. - 2024. - Vol. 14, No. 8. - Art. 2481. https://doi.org/10.3390/buildings14082481</w:t>
+      </w:r>
+    </w:p>
+    <w:p>
+      <w:pPr>
+        <w:pStyle w:val="Body"/>
+        <w:ind w:firstLine="0"/>
+      </w:pPr>
+      <w:r>
+        <w:t xml:space="preserve">7. Januszkiewicz K., Kowalski K.G. Air Purification in Highly-Urbanized Areas with Use TiO2: New Approach to Design the Urban Public Space to Benefit Human Condition // IOP Conf. Ser.: Mater. Sci. Eng. - 2019. - Vol. 471. - Art. 092007.</w:t>
+      </w:r>
+    </w:p>
+    <w:p>
+      <w:pPr>
+        <w:pStyle w:val="Body"/>
+        <w:ind w:firstLine="0"/>
+      </w:pPr>
+      <w:r>
+        <w:t xml:space="preserve">8. Gonzalez-Martin J., Kraakman N.J.R., Febrero R., Munoz R. A state-of-the-art review on indoor air pollution and the potential of biotechnologies for indoor air purification // Chemosphere. - 2021. - Vol. 262. - Art. 128376.</w:t>
+      </w:r>
+    </w:p>
+    <w:p>
+      <w:pPr>
+        <w:pStyle w:val="Body"/>
+        <w:ind w:firstLine="0"/>
+      </w:pPr>
+      <w:r>
+        <w:t xml:space="preserve">9. Balakrishnan T.S., Sultan M.T.H., Shahar F.S., et al. From Nature to the Skies: Exploring Bio-Inspired Polymer Coatings for Aerospace Advancements // Preprints. - 2023. doi:10.20944/preprints202308.1403.v1</w:t>
+      </w:r>
+    </w:p>
+    <w:p>
+      <w:pPr>
+        <w:pStyle w:val="Body"/>
+        <w:ind w:firstLine="0"/>
+      </w:pPr>
+      <w:r>
+        <w:t xml:space="preserve">10. Fujishima A., Honda K. Electrochemical photolysis of water at a semiconductor electrode // Nature. - 1972. - Vol. 238. - P. 37-38.</w:t>
+      </w:r>
+    </w:p>
+    <w:p>
+      <w:pPr>
+        <w:pStyle w:val="Body"/>
+        <w:ind w:firstLine="0"/>
+      </w:pPr>
+      <w:r>
+        <w:t xml:space="preserve">11. Fujishima A., Zhang X., Tryk D.A. TiO2 photocatalysis and related surface phenomena // Surface Science Reports. - 2008. - Vol. 63, No. 12. - P. 515-582.</w:t>
+      </w:r>
+    </w:p>
+    <w:p>
+      <w:pPr>
+        <w:pStyle w:val="Body"/>
+        <w:ind w:firstLine="0"/>
+      </w:pPr>
+      <w:r>
+        <w:t xml:space="preserve">12. Chen X., Mao S.S. Titanium dioxide nanomaterials: synthesis, properties, modifications and applications // Chemical Reviews. - 2007. - Vol. 107, No. 7. - P. 2891-2959.</w:t>
+      </w:r>
+    </w:p>
+    <w:p>
+      <w:pPr>
+        <w:pStyle w:val="Body"/>
+        <w:ind w:firstLine="0"/>
+      </w:pPr>
+      <w:r>
+        <w:t xml:space="preserve">13. Hoffmann M.R., Martin S.T., Choi W., Bahnemann D.W. Environmental applications of semiconductor photocatalysis // Chemical Reviews. - 1995. - Vol. 95, No. 1. - P. 69-96.</w:t>
+      </w:r>
+    </w:p>
+    <w:p>
+      <w:pPr>
+        <w:pStyle w:val="Body"/>
+        <w:ind w:firstLine="0"/>
+      </w:pPr>
+      <w:r>
+        <w:t xml:space="preserve">14. Nakata K., Fujishima A. TiO2 photocatalysis: design and applications // Journal of Photochemistry and Photobiology C. - 2012. - Vol. 13, No. 3. - P. 169-189.</w:t>
+      </w:r>
+    </w:p>
+    <w:p>
+      <w:pPr>
+        <w:pStyle w:val="Body"/>
+        <w:ind w:firstLine="0"/>
+      </w:pPr>
+      <w:r>
+        <w:t xml:space="preserve">15. Bansal R.C., Goyal M. Activated Carbon Adsorption. - Boca Raton: CRC Press, 2005. - 487 p.</w:t>
+      </w:r>
+    </w:p>
+    <w:p>
+      <w:pPr>
+        <w:pStyle w:val="Body"/>
+        <w:ind w:firstLine="0"/>
+      </w:pPr>
+      <w:r>
+        <w:t xml:space="preserve">16. Brinker C.J., Scherer G.W. Sol-Gel Science: The Physics and Chemistry of Sol-Gel Processing. - San Diego: Academic Press, 1990. - 908 p.</w:t>
       </w:r>
     </w:p>
     <w:sectPr>

</xml_diff>